<commit_message>
research: brand with the real logo, add motivation and novelty, extend
Embed the teal NONOS wordmark on the cover, rasterized from the repo
brand SVG, so the document carries the real mark rather than a text
stand-in. Add two sections that were missing: why NONOS exists, the
critique of provenance-based trust and the commitments that follow, and
what is novel, the proof-to-code spectrum culminating in MIR extraction,
the machine-audited axiom policy, the reproducible corpus commitment, the
runtime attestation discipline, and evidence as a self-verifying
artifact. The report is now a full treatment at eight thousand words with
thirty-nine formal statements, a complete module inventory and a notation
appendix.
</commit_message>
<xml_diff>
--- a/verification/research/nonos-verification.docx
+++ b/verification/research/nonos-verification.docx
@@ -2,6 +2,47 @@
 <file path=word/document.xml><?xml version="1.0" encoding="utf-8"?>
 <w:document xmlns:w="http://schemas.openxmlformats.org/wordprocessingml/2006/main" xmlns:m="http://schemas.openxmlformats.org/officeDocument/2006/math" xmlns:r="http://schemas.openxmlformats.org/officeDocument/2006/relationships" xmlns:o="urn:schemas-microsoft-com:office:office" xmlns:v="urn:schemas-microsoft-com:vml" xmlns:w10="urn:schemas-microsoft-com:office:word" xmlns:a="http://schemas.openxmlformats.org/drawingml/2006/main" xmlns:pic="http://schemas.openxmlformats.org/drawingml/2006/picture" xmlns:wp="http://schemas.openxmlformats.org/drawingml/2006/wordprocessingDrawing">
   <w:body>
+    <w:p>
+      <w:pPr>
+        <w:jc w:val="center"/>
+        <w:spacing w:before="1400" w:after="200"/>
+      </w:pPr>
+      <w:r>
+        <w:drawing>
+          <wp:inline distT="0" distB="0" distL="0" distR="0">
+            <wp:extent cx="3291840" cy="1155913"/>
+            <wp:effectExtent l="0" t="0" r="0" b="0"/>
+            <wp:docPr id="101" name="NONOS logo"/>
+            <wp:cNvGraphicFramePr/>
+            <a:graphic>
+              <a:graphicData uri="http://schemas.openxmlformats.org/drawingml/2006/picture">
+                <pic:pic>
+                  <pic:nvPicPr>
+                    <pic:cNvPr id="101" name="logo.png"/>
+                    <pic:cNvPicPr/>
+                  </pic:nvPicPr>
+                  <pic:blipFill>
+                    <a:blip r:embed="rIdNonosLogo"/>
+                    <a:stretch>
+                      <a:fillRect/>
+                    </a:stretch>
+                  </pic:blipFill>
+                  <pic:spPr>
+                    <a:xfrm>
+                      <a:off x="0" y="0"/>
+                      <a:ext cx="3291840" cy="1155913"/>
+                    </a:xfrm>
+                    <a:prstGeom prst="rect">
+                      <a:avLst/>
+                    </a:prstGeom>
+                  </pic:spPr>
+                </pic:pic>
+              </a:graphicData>
+            </a:graphic>
+          </wp:inline>
+        </w:drawing>
+      </w:r>
+    </w:p>
     <w:p>
       <w:pPr>
         <w:pStyle w:val="Title"/>
@@ -588,7 +629,7 @@
       </w:r>
     </w:p>
     <w:bookmarkEnd w:id="9"/>
-    <w:bookmarkStart w:id="10" w:name="the-system-under-verification"/>
+    <w:bookmarkStart w:id="10" w:name="motivation-why-nønos-exists"/>
     <w:p>
       <w:pPr>
         <w:pStyle w:val="Heading1"/>
@@ -603,6 +644,724 @@
         <w:tab/>
       </w:r>
       <w:r>
+        <w:t xml:space="preserve">Motivation: Why NØNOS Exists</w:t>
+      </w:r>
+    </w:p>
+    <w:p>
+      <w:pPr>
+        <w:pStyle w:val="FirstParagraph"/>
+      </w:pPr>
+      <w:r>
+        <w:t xml:space="preserve">Modern operating systems decide what to trust the wrong way. They trust code by</w:t>
+      </w:r>
+      <w:r>
+        <w:t xml:space="preserve"> </w:t>
+      </w:r>
+      <w:r>
+        <w:t xml:space="preserve">where it came from: a package signed by a vendor, a binary in a root-owned</w:t>
+      </w:r>
+      <w:r>
+        <w:t xml:space="preserve"> </w:t>
+      </w:r>
+      <w:r>
+        <w:t xml:space="preserve">directory, a process started by the right user. Provenance is a proxy for</w:t>
+      </w:r>
+      <w:r>
+        <w:t xml:space="preserve"> </w:t>
+      </w:r>
+      <w:r>
+        <w:t xml:space="preserve">trustworthiness, and it is a poor one. It says nothing about what the code will</w:t>
+      </w:r>
+      <w:r>
+        <w:t xml:space="preserve"> </w:t>
+      </w:r>
+      <w:r>
+        <w:t xml:space="preserve">do, and it fails exactly when it matters, when an attacker controls the</w:t>
+      </w:r>
+      <w:r>
+        <w:t xml:space="preserve"> </w:t>
+      </w:r>
+      <w:r>
+        <w:t xml:space="preserve">provenance. Every privilege-escalation chain, every supply-chain compromise, and</w:t>
+      </w:r>
+      <w:r>
+        <w:t xml:space="preserve"> </w:t>
+      </w:r>
+      <w:r>
+        <w:t xml:space="preserve">every driver that turns a peripheral into a foothold is a failure of</w:t>
+      </w:r>
+      <w:r>
+        <w:t xml:space="preserve"> </w:t>
+      </w:r>
+      <w:r>
+        <w:t xml:space="preserve">provenance-based trust. The industry’s response has been to add more layers of</w:t>
+      </w:r>
+      <w:r>
+        <w:t xml:space="preserve"> </w:t>
+      </w:r>
+      <w:r>
+        <w:t xml:space="preserve">the same idea: more signatures, more sandboxes, more allowlists, each trusting</w:t>
+      </w:r>
+      <w:r>
+        <w:t xml:space="preserve"> </w:t>
+      </w:r>
+      <w:r>
+        <w:t xml:space="preserve">the layer below by where it sits rather than by what it is.</w:t>
+      </w:r>
+    </w:p>
+    <w:p>
+      <w:pPr>
+        <w:pStyle w:val="BodyText"/>
+      </w:pPr>
+      <w:r>
+        <w:t xml:space="preserve">NØNOS begins from a different premise: a program should be admitted to execution</w:t>
+      </w:r>
+      <w:r>
+        <w:t xml:space="preserve"> </w:t>
+      </w:r>
+      <w:r>
+        <w:t xml:space="preserve">only if it can</w:t>
+      </w:r>
+      <w:r>
+        <w:t xml:space="preserve"> </w:t>
+      </w:r>
+      <w:r>
+        <w:rPr>
+          <w:i/>
+          <w:iCs/>
+        </w:rPr>
+        <w:t xml:space="preserve">prove</w:t>
+      </w:r>
+      <w:r>
+        <w:t xml:space="preserve"> </w:t>
+      </w:r>
+      <w:r>
+        <w:t xml:space="preserve">what it is and what it may touch, and the system should</w:t>
+      </w:r>
+      <w:r>
+        <w:t xml:space="preserve"> </w:t>
+      </w:r>
+      <w:r>
+        <w:rPr>
+          <w:i/>
+          <w:iCs/>
+        </w:rPr>
+        <w:t xml:space="preserve">verify</w:t>
+      </w:r>
+      <w:r>
+        <w:t xml:space="preserve"> </w:t>
+      </w:r>
+      <w:r>
+        <w:t xml:space="preserve">that proof, mechanically, before it runs and every time it runs. This</w:t>
+      </w:r>
+      <w:r>
+        <w:t xml:space="preserve"> </w:t>
+      </w:r>
+      <w:r>
+        <w:t xml:space="preserve">turns trust from a property of origin into a property of demonstration. There is</w:t>
+      </w:r>
+      <w:r>
+        <w:t xml:space="preserve"> </w:t>
+      </w:r>
+      <w:r>
+        <w:t xml:space="preserve">no ambient authority, no privileged account that bypasses the check, and no</w:t>
+      </w:r>
+      <w:r>
+        <w:t xml:space="preserve"> </w:t>
+      </w:r>
+      <w:r>
+        <w:t xml:space="preserve">build-time switch that disables it on the shipping image. Authority is held only</w:t>
+      </w:r>
+      <w:r>
+        <w:t xml:space="preserve"> </w:t>
+      </w:r>
+      <w:r>
+        <w:t xml:space="preserve">as capabilities and flows in one direction, downward from a root the reader can</w:t>
+      </w:r>
+      <w:r>
+        <w:t xml:space="preserve"> </w:t>
+      </w:r>
+      <w:r>
+        <w:t xml:space="preserve">inspect, attenuating at every hop. The result is a system whose security posture</w:t>
+      </w:r>
+      <w:r>
+        <w:t xml:space="preserve"> </w:t>
+      </w:r>
+      <w:r>
+        <w:t xml:space="preserve">is not a policy layered on top but a consequence of its construction.</w:t>
+      </w:r>
+    </w:p>
+    <w:p>
+      <w:pPr>
+        <w:pStyle w:val="BodyText"/>
+      </w:pPr>
+      <w:r>
+        <w:t xml:space="preserve">Three commitments follow from that premise, and they are the reason the system</w:t>
+      </w:r>
+      <w:r>
+        <w:t xml:space="preserve"> </w:t>
+      </w:r>
+      <w:r>
+        <w:t xml:space="preserve">is shaped as it is. First, the trusted computing base is made small on purpose:</w:t>
+      </w:r>
+      <w:r>
+        <w:t xml:space="preserve"> </w:t>
+      </w:r>
+      <w:r>
+        <w:t xml:space="preserve">the kernel holds only primitives, and every driver is a userspace capsule behind</w:t>
+      </w:r>
+      <w:r>
+        <w:t xml:space="preserve"> </w:t>
+      </w:r>
+      <w:r>
+        <w:t xml:space="preserve">the same boundary as any other program, so the surface that must be correct is</w:t>
+      </w:r>
+      <w:r>
+        <w:t xml:space="preserve"> </w:t>
+      </w:r>
+      <w:r>
+        <w:t xml:space="preserve">narrow enough to prove. Second, the implementation language is memory-safe, which</w:t>
+      </w:r>
+      <w:r>
+        <w:t xml:space="preserve"> </w:t>
+      </w:r>
+      <w:r>
+        <w:t xml:space="preserve">removes by construction the largest historical class of kernel defects, the</w:t>
+      </w:r>
+      <w:r>
+        <w:t xml:space="preserve"> </w:t>
+      </w:r>
+      <w:r>
+        <w:t xml:space="preserve">spatial and temporal memory-corruption bugs that a C kernel’s proof must labor to</w:t>
+      </w:r>
+      <w:r>
+        <w:t xml:space="preserve"> </w:t>
+      </w:r>
+      <w:r>
+        <w:t xml:space="preserve">exclude, so the proof effort can be spent on the properties that remain. Third,</w:t>
+      </w:r>
+      <w:r>
+        <w:t xml:space="preserve"> </w:t>
+      </w:r>
+      <w:r>
+        <w:t xml:space="preserve">the system keeps no mutable state on disk and leaves nothing behind at power-off,</w:t>
+      </w:r>
+      <w:r>
+        <w:t xml:space="preserve"> </w:t>
+      </w:r>
+      <w:r>
+        <w:t xml:space="preserve">the ZeroState model, so that the medium which carries state across a program’s</w:t>
+      </w:r>
+      <w:r>
+        <w:t xml:space="preserve"> </w:t>
+      </w:r>
+      <w:r>
+        <w:t xml:space="preserve">life, memory, is the one place a residue could survive, and scrubbing it closes</w:t>
+      </w:r>
+      <w:r>
+        <w:t xml:space="preserve"> </w:t>
+      </w:r>
+      <w:r>
+        <w:t xml:space="preserve">the leak.</w:t>
+      </w:r>
+    </w:p>
+    <w:p>
+      <w:pPr>
+        <w:pStyle w:val="BodyText"/>
+      </w:pPr>
+      <w:r>
+        <w:t xml:space="preserve">The deeper motivation is that a security claim should be checkable by a</w:t>
+      </w:r>
+      <w:r>
+        <w:t xml:space="preserve"> </w:t>
+      </w:r>
+      <w:r>
+        <w:t xml:space="preserve">skeptic, not accepted on the authority of the people who make it. The industry</w:t>
+      </w:r>
+      <w:r>
+        <w:t xml:space="preserve"> </w:t>
+      </w:r>
+      <w:r>
+        <w:t xml:space="preserve">is full of systems described as secure, hardened, or even formally verified,</w:t>
+      </w:r>
+      <w:r>
+        <w:t xml:space="preserve"> </w:t>
+      </w:r>
+      <w:r>
+        <w:t xml:space="preserve">whose claims cannot be reproduced, whose proofs are decoupled from the running</w:t>
+      </w:r>
+      <w:r>
+        <w:t xml:space="preserve"> </w:t>
+      </w:r>
+      <w:r>
+        <w:t xml:space="preserve">code, or whose theorems are left unfinished behind a placeholder. NØNOS is built</w:t>
+      </w:r>
+      <w:r>
+        <w:t xml:space="preserve"> </w:t>
+      </w:r>
+      <w:r>
+        <w:t xml:space="preserve">so that every claim in this document can be reproduced from a clean checkout by a</w:t>
+      </w:r>
+      <w:r>
+        <w:t xml:space="preserve"> </w:t>
+      </w:r>
+      <w:r>
+        <w:t xml:space="preserve">reader who trusts none of the authors, and so that the claims cannot silently</w:t>
+      </w:r>
+      <w:r>
+        <w:t xml:space="preserve"> </w:t>
+      </w:r>
+      <w:r>
+        <w:t xml:space="preserve">decay: they are continuously re-checked, and the numbers are a machine-verified</w:t>
+      </w:r>
+      <w:r>
+        <w:t xml:space="preserve"> </w:t>
+      </w:r>
+      <w:r>
+        <w:t xml:space="preserve">artifact rather than a sentence in a slide deck. This is the</w:t>
+      </w:r>
+      <w:r>
+        <w:t xml:space="preserve"> </w:t>
+      </w:r>
+      <w:r>
+        <w:t xml:space="preserve">“why”</w:t>
+      </w:r>
+      <w:r>
+        <w:t xml:space="preserve">. The rest of</w:t>
+      </w:r>
+      <w:r>
+        <w:t xml:space="preserve"> </w:t>
+      </w:r>
+      <w:r>
+        <w:t xml:space="preserve">the paper is the</w:t>
+      </w:r>
+      <w:r>
+        <w:t xml:space="preserve"> </w:t>
+      </w:r>
+      <w:r>
+        <w:t xml:space="preserve">“how”</w:t>
+      </w:r>
+      <w:r>
+        <w:t xml:space="preserve">.</w:t>
+      </w:r>
+    </w:p>
+    <w:bookmarkEnd w:id="10"/>
+    <w:bookmarkStart w:id="11" w:name="what-is-novel"/>
+    <w:p>
+      <w:pPr>
+        <w:pStyle w:val="Heading1"/>
+      </w:pPr>
+      <w:r>
+        <w:rPr>
+          <w:rStyle w:val="SectionNumber"/>
+        </w:rPr>
+        <w:t xml:space="preserve">3</w:t>
+      </w:r>
+      <w:r>
+        <w:tab/>
+      </w:r>
+      <w:r>
+        <w:t xml:space="preserve">What Is Novel</w:t>
+      </w:r>
+    </w:p>
+    <w:p>
+      <w:pPr>
+        <w:pStyle w:val="FirstParagraph"/>
+      </w:pPr>
+      <w:r>
+        <w:t xml:space="preserve">NØNOS does not claim to out-verify seL4 on seL4’s own terms; that is not the</w:t>
+      </w:r>
+      <w:r>
+        <w:t xml:space="preserve"> </w:t>
+      </w:r>
+      <w:r>
+        <w:t xml:space="preserve">contribution. The contribution is a way of building a large, useful,</w:t>
+      </w:r>
+      <w:r>
+        <w:t xml:space="preserve"> </w:t>
+      </w:r>
+      <w:r>
+        <w:t xml:space="preserve">memory-safe system so that its security-critical behaviour is machine-checked</w:t>
+      </w:r>
+      <w:r>
+        <w:t xml:space="preserve"> </w:t>
+      </w:r>
+      <w:r>
+        <w:t xml:space="preserve">over the code that runs, and several elements of the approach are, to our</w:t>
+      </w:r>
+      <w:r>
+        <w:t xml:space="preserve"> </w:t>
+      </w:r>
+      <w:r>
+        <w:t xml:space="preserve">knowledge, either new or newly combined at this scale.</w:t>
+      </w:r>
+    </w:p>
+    <w:p>
+      <w:pPr>
+        <w:pStyle w:val="BodyText"/>
+      </w:pPr>
+      <w:r>
+        <w:rPr>
+          <w:b/>
+          <w:bCs/>
+        </w:rPr>
+        <w:t xml:space="preserve">A proof-to-code spectrum, ordered by fidelity, culminating in MIR extraction.</w:t>
+      </w:r>
+      <w:r>
+        <w:t xml:space="preserve"> </w:t>
+      </w:r>
+      <w:r>
+        <w:t xml:space="preserve">Most verification efforts pick a single point: an abstract model with no link to</w:t>
+      </w:r>
+      <w:r>
+        <w:t xml:space="preserve"> </w:t>
+      </w:r>
+      <w:r>
+        <w:t xml:space="preserve">the code, or a heroic total-correctness refinement for a minimal kernel. NØNOS</w:t>
+      </w:r>
+      <w:r>
+        <w:t xml:space="preserve"> </w:t>
+      </w:r>
+      <w:r>
+        <w:t xml:space="preserve">instead layers techniques by how tightly each binds to the executable, from a</w:t>
+      </w:r>
+      <w:r>
+        <w:t xml:space="preserve"> </w:t>
+      </w:r>
+      <w:r>
+        <w:t xml:space="preserve">source-hygiene floor, through proofs that execute the real source and bounded</w:t>
+      </w:r>
+      <w:r>
+        <w:t xml:space="preserve"> </w:t>
+      </w:r>
+      <w:r>
+        <w:t xml:space="preserve">model checking, to abstract Lean theorems, to Verus over the real bit-operations,</w:t>
+      </w:r>
+      <w:r>
+        <w:t xml:space="preserve"> </w:t>
+      </w:r>
+      <w:r>
+        <w:t xml:space="preserve">and finally to definitions lowered from the compiler’s own MIR by Charon and</w:t>
+      </w:r>
+      <w:r>
+        <w:t xml:space="preserve"> </w:t>
+      </w:r>
+      <w:r>
+        <w:t xml:space="preserve">Aeneas and proven in Lean. The last layer removes the human transcription step</w:t>
+      </w:r>
+      <w:r>
+        <w:t xml:space="preserve"> </w:t>
+      </w:r>
+      <w:r>
+        <w:t xml:space="preserve">entirely: the object proved is the compiler’s lowering of the function that runs,</w:t>
+      </w:r>
+      <w:r>
+        <w:t xml:space="preserve"> </w:t>
+      </w:r>
+      <w:r>
+        <w:t xml:space="preserve">not a model a person retyped from it. Applying this Rust-verification toolchain</w:t>
+      </w:r>
+      <w:r>
+        <w:t xml:space="preserve"> </w:t>
+      </w:r>
+      <w:r>
+        <w:t xml:space="preserve">to live kernel functions, and organizing an entire kernel’s security surface</w:t>
+      </w:r>
+      <w:r>
+        <w:t xml:space="preserve"> </w:t>
+      </w:r>
+      <w:r>
+        <w:t xml:space="preserve">along this spectrum, is the central novelty.</w:t>
+      </w:r>
+    </w:p>
+    <w:p>
+      <w:pPr>
+        <w:pStyle w:val="BodyText"/>
+      </w:pPr>
+      <w:r>
+        <w:rPr>
+          <w:b/>
+          <w:bCs/>
+        </w:rPr>
+        <w:t xml:space="preserve">A machine-audited axiom policy, enforced continuously.</w:t>
+      </w:r>
+      <w:r>
+        <w:t xml:space="preserve"> </w:t>
+      </w:r>
+      <w:r>
+        <w:t xml:space="preserve">Every flagship</w:t>
+      </w:r>
+      <w:r>
+        <w:t xml:space="preserve"> </w:t>
+      </w:r>
+      <w:r>
+        <w:t xml:space="preserve">theorem’s complete axiom closure is computed by the proof kernel and checked in</w:t>
+      </w:r>
+      <w:r>
+        <w:t xml:space="preserve"> </w:t>
+      </w:r>
+      <w:r>
+        <w:t xml:space="preserve">continuous integration to contain only the three standard axioms and never the</w:t>
+      </w:r>
+      <w:r>
+        <w:t xml:space="preserve"> </w:t>
+      </w:r>
+      <w:r>
+        <w:t xml:space="preserve">placeholder a</w:t>
+      </w:r>
+      <w:r>
+        <w:t xml:space="preserve"> </w:t>
+      </w:r>
+      <w:r>
+        <w:rPr>
+          <w:rStyle w:val="VerbatimChar"/>
+        </w:rPr>
+        <w:t xml:space="preserve">sorry</w:t>
+      </w:r>
+      <w:r>
+        <w:t xml:space="preserve"> </w:t>
+      </w:r>
+      <w:r>
+        <w:t xml:space="preserve">introduces. A verification claim can therefore not rest on</w:t>
+      </w:r>
+      <w:r>
+        <w:t xml:space="preserve"> </w:t>
+      </w:r>
+      <w:r>
+        <w:t xml:space="preserve">an unproven step without failing the build. This moves the guarantee from</w:t>
+      </w:r>
+      <w:r>
+        <w:t xml:space="preserve"> </w:t>
+      </w:r>
+      <w:r>
+        <w:t xml:space="preserve">“the</w:t>
+      </w:r>
+      <w:r>
+        <w:t xml:space="preserve"> </w:t>
+      </w:r>
+      <w:r>
+        <w:t xml:space="preserve">authors say it is proven”</w:t>
+      </w:r>
+      <w:r>
+        <w:t xml:space="preserve"> </w:t>
+      </w:r>
+      <w:r>
+        <w:t xml:space="preserve">to</w:t>
+      </w:r>
+      <w:r>
+        <w:t xml:space="preserve"> </w:t>
+      </w:r>
+      <w:r>
+        <w:t xml:space="preserve">“the proof kernel says it is proven, on every</w:t>
+      </w:r>
+      <w:r>
+        <w:t xml:space="preserve"> </w:t>
+      </w:r>
+      <w:r>
+        <w:t xml:space="preserve">push”</w:t>
+      </w:r>
+      <w:r>
+        <w:t xml:space="preserve">, at the granularity of a single theorem.</w:t>
+      </w:r>
+    </w:p>
+    <w:p>
+      <w:pPr>
+        <w:pStyle w:val="BodyText"/>
+      </w:pPr>
+      <w:r>
+        <w:rPr>
+          <w:b/>
+          <w:bCs/>
+        </w:rPr>
+        <w:t xml:space="preserve">A reproducible commitment to the proven corpus.</w:t>
+      </w:r>
+      <w:r>
+        <w:t xml:space="preserve"> </w:t>
+      </w:r>
+      <w:r>
+        <w:t xml:space="preserve">The proof-corpus root binds</w:t>
+      </w:r>
+      <w:r>
+        <w:t xml:space="preserve"> </w:t>
+      </w:r>
+      <w:r>
+        <w:t xml:space="preserve">the entire set of proven properties, under a specific toolchain, to a single</w:t>
+      </w:r>
+      <w:r>
+        <w:t xml:space="preserve"> </w:t>
+      </w:r>
+      <w:r>
+        <w:t xml:space="preserve">reproducible 32-byte value that refuses to form in the presence of any</w:t>
+      </w:r>
+      <w:r>
+        <w:t xml:space="preserve"> </w:t>
+      </w:r>
+      <w:r>
+        <w:t xml:space="preserve">unfinished proof. It is the seed of a runtime binding, described in the future</w:t>
+      </w:r>
+      <w:r>
+        <w:t xml:space="preserve"> </w:t>
+      </w:r>
+      <w:r>
+        <w:t xml:space="preserve">work, that would let a boot attestation commit to exactly which properties were</w:t>
+      </w:r>
+      <w:r>
+        <w:t xml:space="preserve"> </w:t>
+      </w:r>
+      <w:r>
+        <w:t xml:space="preserve">machine-checked of the image being booted, checkable by anyone who rebuilds the</w:t>
+      </w:r>
+      <w:r>
+        <w:t xml:space="preserve"> </w:t>
+      </w:r>
+      <w:r>
+        <w:t xml:space="preserve">repository.</w:t>
+      </w:r>
+    </w:p>
+    <w:p>
+      <w:pPr>
+        <w:pStyle w:val="BodyText"/>
+      </w:pPr>
+      <w:r>
+        <w:rPr>
+          <w:b/>
+          <w:bCs/>
+        </w:rPr>
+        <w:t xml:space="preserve">Verification as a runtime discipline, not only a static one.</w:t>
+      </w:r>
+      <w:r>
+        <w:t xml:space="preserve"> </w:t>
+      </w:r>
+      <w:r>
+        <w:t xml:space="preserve">The proven</w:t>
+      </w:r>
+      <w:r>
+        <w:t xml:space="preserve"> </w:t>
+      </w:r>
+      <w:r>
+        <w:t xml:space="preserve">admission rules are not merely checked once at build time; a transparent,</w:t>
+      </w:r>
+      <w:r>
+        <w:t xml:space="preserve"> </w:t>
+      </w:r>
+      <w:r>
+        <w:t xml:space="preserve">post-quantum attestation gate enforces them at every capsule spawn and at boot,</w:t>
+      </w:r>
+      <w:r>
+        <w:t xml:space="preserve"> </w:t>
+      </w:r>
+      <w:r>
+        <w:t xml:space="preserve">so the properties proven in Lean are the same discipline the running kernel</w:t>
+      </w:r>
+      <w:r>
+        <w:t xml:space="preserve"> </w:t>
+      </w:r>
+      <w:r>
+        <w:t xml:space="preserve">imposes on what it will execute. The static proof and the runtime check are two</w:t>
+      </w:r>
+      <w:r>
+        <w:t xml:space="preserve"> </w:t>
+      </w:r>
+      <w:r>
+        <w:t xml:space="preserve">faces of one rule.</w:t>
+      </w:r>
+    </w:p>
+    <w:p>
+      <w:pPr>
+        <w:pStyle w:val="BodyText"/>
+      </w:pPr>
+      <w:r>
+        <w:rPr>
+          <w:b/>
+          <w:bCs/>
+        </w:rPr>
+        <w:t xml:space="preserve">Evidence as a first-class, self-verifying artifact.</w:t>
+      </w:r>
+      <w:r>
+        <w:t xml:space="preserve"> </w:t>
+      </w:r>
+      <w:r>
+        <w:t xml:space="preserve">The entire verification</w:t>
+      </w:r>
+      <w:r>
+        <w:t xml:space="preserve"> </w:t>
+      </w:r>
+      <w:r>
+        <w:t xml:space="preserve">surface is inventoried in a machine-readable manifest generated from the source</w:t>
+      </w:r>
+      <w:r>
+        <w:t xml:space="preserve"> </w:t>
+      </w:r>
+      <w:r>
+        <w:t xml:space="preserve">and diff-checked in CI, so the repository carries an accurate, continuously</w:t>
+      </w:r>
+      <w:r>
+        <w:t xml:space="preserve"> </w:t>
+      </w:r>
+      <w:r>
+        <w:t xml:space="preserve">verified statement of exactly what it proves and how. The claims and the evidence</w:t>
+      </w:r>
+      <w:r>
+        <w:t xml:space="preserve"> </w:t>
+      </w:r>
+      <w:r>
+        <w:t xml:space="preserve">for them travel together and cannot drift apart.</w:t>
+      </w:r>
+    </w:p>
+    <w:p>
+      <w:pPr>
+        <w:pStyle w:val="BodyText"/>
+      </w:pPr>
+      <w:r>
+        <w:t xml:space="preserve">None of these elements in isolation is the whole story; the combination, applied</w:t>
+      </w:r>
+      <w:r>
+        <w:t xml:space="preserve"> </w:t>
+      </w:r>
+      <w:r>
+        <w:t xml:space="preserve">to a real memory-safe microkernel that boots to a graphical desktop on real</w:t>
+      </w:r>
+      <w:r>
+        <w:t xml:space="preserve"> </w:t>
+      </w:r>
+      <w:r>
+        <w:t xml:space="preserve">hardware, is what we mean by revolutionary in a field where</w:t>
+      </w:r>
+      <w:r>
+        <w:t xml:space="preserve"> </w:t>
+      </w:r>
+      <w:r>
+        <w:t xml:space="preserve">“verified”</w:t>
+      </w:r>
+      <w:r>
+        <w:t xml:space="preserve"> </w:t>
+      </w:r>
+      <w:r>
+        <w:t xml:space="preserve">too often</w:t>
+      </w:r>
+      <w:r>
+        <w:t xml:space="preserve"> </w:t>
+      </w:r>
+      <w:r>
+        <w:t xml:space="preserve">means a model no one can connect to the code.</w:t>
+      </w:r>
+    </w:p>
+    <w:bookmarkEnd w:id="11"/>
+    <w:bookmarkStart w:id="12" w:name="the-system-under-verification"/>
+    <w:p>
+      <w:pPr>
+        <w:pStyle w:val="Heading1"/>
+      </w:pPr>
+      <w:r>
+        <w:rPr>
+          <w:rStyle w:val="SectionNumber"/>
+        </w:rPr>
+        <w:t xml:space="preserve">4</w:t>
+      </w:r>
+      <w:r>
+        <w:tab/>
+      </w:r>
+      <w:r>
         <w:t xml:space="preserve">The System Under Verification</w:t>
       </w:r>
     </w:p>
@@ -832,8 +1591,8 @@
         <w:t xml:space="preserve">promises.</w:t>
       </w:r>
     </w:p>
-    <w:bookmarkEnd w:id="10"/>
-    <w:bookmarkStart w:id="11" w:name="preliminaries-and-notation"/>
+    <w:bookmarkEnd w:id="12"/>
+    <w:bookmarkStart w:id="13" w:name="preliminaries-and-notation"/>
     <w:p>
       <w:pPr>
         <w:pStyle w:val="Heading1"/>
@@ -842,7 +1601,7 @@
         <w:rPr>
           <w:rStyle w:val="SectionNumber"/>
         </w:rPr>
-        <w:t xml:space="preserve">3</w:t>
+        <w:t xml:space="preserve">5</w:t>
       </w:r>
       <w:r>
         <w:tab/>
@@ -2091,8 +2850,8 @@
         <w:t xml:space="preserve">; CI rejects any run in which admissibility fails.</w:t>
       </w:r>
     </w:p>
-    <w:bookmarkEnd w:id="11"/>
-    <w:bookmarkStart w:id="12" w:name="the-verification-architecture"/>
+    <w:bookmarkEnd w:id="13"/>
+    <w:bookmarkStart w:id="14" w:name="the-verification-architecture"/>
     <w:p>
       <w:pPr>
         <w:pStyle w:val="Heading1"/>
@@ -2101,7 +2860,7 @@
         <w:rPr>
           <w:rStyle w:val="SectionNumber"/>
         </w:rPr>
-        <w:t xml:space="preserve">4</w:t>
+        <w:t xml:space="preserve">6</w:t>
       </w:r>
       <w:r>
         <w:tab/>
@@ -2437,8 +3196,8 @@
         <w:t xml:space="preserve">into Lean and proven there (§5), the tightest link.</w:t>
       </w:r>
     </w:p>
-    <w:bookmarkEnd w:id="12"/>
-    <w:bookmarkStart w:id="27" w:name="the-lean-specification-corpus"/>
+    <w:bookmarkEnd w:id="14"/>
+    <w:bookmarkStart w:id="29" w:name="the-lean-specification-corpus"/>
     <w:p>
       <w:pPr>
         <w:pStyle w:val="Heading1"/>
@@ -2447,7 +3206,7 @@
         <w:rPr>
           <w:rStyle w:val="SectionNumber"/>
         </w:rPr>
-        <w:t xml:space="preserve">5</w:t>
+        <w:t xml:space="preserve">7</w:t>
       </w:r>
       <w:r>
         <w:tab/>
@@ -2524,7 +3283,7 @@
         <w:t xml:space="preserve">.</w:t>
       </w:r>
     </w:p>
-    <w:bookmarkStart w:id="13" w:name="capability-delegation"/>
+    <w:bookmarkStart w:id="15" w:name="capability-delegation"/>
     <w:p>
       <w:pPr>
         <w:pStyle w:val="Heading2"/>
@@ -2533,7 +3292,7 @@
         <w:rPr>
           <w:rStyle w:val="SectionNumber"/>
         </w:rPr>
-        <w:t xml:space="preserve">5.1</w:t>
+        <w:t xml:space="preserve">7.1</w:t>
       </w:r>
       <w:r>
         <w:tab/>
@@ -3679,8 +4438,8 @@
         <w:t xml:space="preserve">removes any other, and never revokes.</w:t>
       </w:r>
     </w:p>
-    <w:bookmarkEnd w:id="13"/>
-    <w:bookmarkStart w:id="14" w:name="the-userkernel-boundary"/>
+    <w:bookmarkEnd w:id="15"/>
+    <w:bookmarkStart w:id="16" w:name="the-userkernel-boundary"/>
     <w:p>
       <w:pPr>
         <w:pStyle w:val="Heading2"/>
@@ -3689,7 +4448,7 @@
         <w:rPr>
           <w:rStyle w:val="SectionNumber"/>
         </w:rPr>
-        <w:t xml:space="preserve">5.2</w:t>
+        <w:t xml:space="preserve">7.2</w:t>
       </w:r>
       <w:r>
         <w:tab/>
@@ -4138,8 +4897,8 @@
         <w:t xml:space="preserve">memory above.</w:t>
       </w:r>
     </w:p>
-    <w:bookmarkEnd w:id="14"/>
-    <w:bookmarkStart w:id="15" w:name="anti-rollback-and-a-concrete-refinement"/>
+    <w:bookmarkEnd w:id="16"/>
+    <w:bookmarkStart w:id="17" w:name="anti-rollback-and-a-concrete-refinement"/>
     <w:p>
       <w:pPr>
         <w:pStyle w:val="Heading2"/>
@@ -4148,7 +4907,7 @@
         <w:rPr>
           <w:rStyle w:val="SectionNumber"/>
         </w:rPr>
-        <w:t xml:space="preserve">5.3</w:t>
+        <w:t xml:space="preserve">7.3</w:t>
       </w:r>
       <w:r>
         <w:tab/>
@@ -4783,8 +5542,8 @@
         <w:t xml:space="preserve">no-rollback theorem holds of the code’s real control flow.</w:t>
       </w:r>
     </w:p>
-    <w:bookmarkEnd w:id="15"/>
-    <w:bookmarkStart w:id="16" w:name="the-hardware-broker"/>
+    <w:bookmarkEnd w:id="17"/>
+    <w:bookmarkStart w:id="18" w:name="the-hardware-broker"/>
     <w:p>
       <w:pPr>
         <w:pStyle w:val="Heading2"/>
@@ -4793,7 +5552,7 @@
         <w:rPr>
           <w:rStyle w:val="SectionNumber"/>
         </w:rPr>
-        <w:t xml:space="preserve">5.4</w:t>
+        <w:t xml:space="preserve">7.4</w:t>
       </w:r>
       <w:r>
         <w:tab/>
@@ -5089,8 +5848,8 @@
         <w:t xml:space="preserve">began inside it (in which case the safe length is zero).</w:t>
       </w:r>
     </w:p>
-    <w:bookmarkEnd w:id="16"/>
-    <w:bookmarkStart w:id="17" w:name="the-loader-and-the-wx-invariant"/>
+    <w:bookmarkEnd w:id="18"/>
+    <w:bookmarkStart w:id="19" w:name="the-loader-and-the-wx-invariant"/>
     <w:p>
       <w:pPr>
         <w:pStyle w:val="Heading2"/>
@@ -5099,7 +5858,7 @@
         <w:rPr>
           <w:rStyle w:val="SectionNumber"/>
         </w:rPr>
-        <w:t xml:space="preserve">5.5</w:t>
+        <w:t xml:space="preserve">7.5</w:t>
       </w:r>
       <w:r>
         <w:tab/>
@@ -5357,8 +6116,8 @@
         <w:t xml:space="preserve">nothing or writes wholly inside a segment.</w:t>
       </w:r>
     </w:p>
-    <w:bookmarkEnd w:id="17"/>
-    <w:bookmarkStart w:id="18" w:name="resource-allocation-and-dispatch"/>
+    <w:bookmarkEnd w:id="19"/>
+    <w:bookmarkStart w:id="20" w:name="resource-allocation-and-dispatch"/>
     <w:p>
       <w:pPr>
         <w:pStyle w:val="Heading2"/>
@@ -5367,7 +6126,7 @@
         <w:rPr>
           <w:rStyle w:val="SectionNumber"/>
         </w:rPr>
-        <w:t xml:space="preserve">5.6</w:t>
+        <w:t xml:space="preserve">7.6</w:t>
       </w:r>
       <w:r>
         <w:tab/>
@@ -5660,8 +6419,8 @@
         <w:t xml:space="preserve">already owns.</w:t>
       </w:r>
     </w:p>
-    <w:bookmarkEnd w:id="18"/>
-    <w:bookmarkStart w:id="19" w:name="X303216f44db9daa9f847ea92d8f4d4649324830"/>
+    <w:bookmarkEnd w:id="20"/>
+    <w:bookmarkStart w:id="21" w:name="X303216f44db9daa9f847ea92d8f4d4649324830"/>
     <w:p>
       <w:pPr>
         <w:pStyle w:val="Heading2"/>
@@ -5670,7 +6429,7 @@
         <w:rPr>
           <w:rStyle w:val="SectionNumber"/>
         </w:rPr>
-        <w:t xml:space="preserve">5.7</w:t>
+        <w:t xml:space="preserve">7.7</w:t>
       </w:r>
       <w:r>
         <w:tab/>
@@ -5919,8 +6678,8 @@
         <w:t xml:space="preserve">frame replayed cannot advance the connection.</w:t>
       </w:r>
     </w:p>
-    <w:bookmarkEnd w:id="19"/>
-    <w:bookmarkStart w:id="20" w:name="memory-management"/>
+    <w:bookmarkEnd w:id="21"/>
+    <w:bookmarkStart w:id="22" w:name="memory-management"/>
     <w:p>
       <w:pPr>
         <w:pStyle w:val="Heading2"/>
@@ -5929,7 +6688,7 @@
         <w:rPr>
           <w:rStyle w:val="SectionNumber"/>
         </w:rPr>
-        <w:t xml:space="preserve">5.8</w:t>
+        <w:t xml:space="preserve">7.8</w:t>
       </w:r>
       <w:r>
         <w:tab/>
@@ -6324,8 +7083,8 @@
         <w:t xml:space="preserve">check cannot be fooled into admitting an out-of-range access.</w:t>
       </w:r>
     </w:p>
-    <w:bookmarkEnd w:id="20"/>
-    <w:bookmarkStart w:id="21" w:name="synchronization"/>
+    <w:bookmarkEnd w:id="22"/>
+    <w:bookmarkStart w:id="23" w:name="synchronization"/>
     <w:p>
       <w:pPr>
         <w:pStyle w:val="Heading2"/>
@@ -6334,7 +7093,7 @@
         <w:rPr>
           <w:rStyle w:val="SectionNumber"/>
         </w:rPr>
-        <w:t xml:space="preserve">5.9</w:t>
+        <w:t xml:space="preserve">7.9</w:t>
       </w:r>
       <w:r>
         <w:tab/>
@@ -6683,8 +7442,8 @@
         <w:t xml:space="preserve">thread races ahead of a phase boundary.</w:t>
       </w:r>
     </w:p>
-    <w:bookmarkEnd w:id="21"/>
-    <w:bookmarkStart w:id="22" w:name="concurrent-reclamation-and-lifecycle"/>
+    <w:bookmarkEnd w:id="23"/>
+    <w:bookmarkStart w:id="24" w:name="concurrent-reclamation-and-lifecycle"/>
     <w:p>
       <w:pPr>
         <w:pStyle w:val="Heading2"/>
@@ -6693,7 +7452,7 @@
         <w:rPr>
           <w:rStyle w:val="SectionNumber"/>
         </w:rPr>
-        <w:t xml:space="preserve">5.10</w:t>
+        <w:t xml:space="preserve">7.10</w:t>
       </w:r>
       <w:r>
         <w:tab/>
@@ -6846,8 +7605,8 @@
         <w:t xml:space="preserve">not granted and ends holding none.</w:t>
       </w:r>
     </w:p>
-    <w:bookmarkEnd w:id="22"/>
-    <w:bookmarkStart w:id="23" w:name="Xc2374e5b643ea43bd2f204f119d9b9a934995ce"/>
+    <w:bookmarkEnd w:id="24"/>
+    <w:bookmarkStart w:id="25" w:name="Xc2374e5b643ea43bd2f204f119d9b9a934995ce"/>
     <w:p>
       <w:pPr>
         <w:pStyle w:val="Heading2"/>
@@ -6856,7 +7615,7 @@
         <w:rPr>
           <w:rStyle w:val="SectionNumber"/>
         </w:rPr>
-        <w:t xml:space="preserve">5.11</w:t>
+        <w:t xml:space="preserve">7.11</w:t>
       </w:r>
       <w:r>
         <w:tab/>
@@ -7109,8 +7868,8 @@
         <w:t xml:space="preserve">burst.</w:t>
       </w:r>
     </w:p>
-    <w:bookmarkEnd w:id="23"/>
-    <w:bookmarkStart w:id="24" w:name="X6c13ce4c538f8f68bfdc852d39259ef0a041351"/>
+    <w:bookmarkEnd w:id="25"/>
+    <w:bookmarkStart w:id="26" w:name="X6c13ce4c538f8f68bfdc852d39259ef0a041351"/>
     <w:p>
       <w:pPr>
         <w:pStyle w:val="Heading2"/>
@@ -7119,7 +7878,7 @@
         <w:rPr>
           <w:rStyle w:val="SectionNumber"/>
         </w:rPr>
-        <w:t xml:space="preserve">5.12</w:t>
+        <w:t xml:space="preserve">7.12</w:t>
       </w:r>
       <w:r>
         <w:tab/>
@@ -7322,8 +8081,8 @@
         <w:t xml:space="preserve">scope every mint to the boot that issued it.</w:t>
       </w:r>
     </w:p>
-    <w:bookmarkEnd w:id="24"/>
-    <w:bookmarkStart w:id="25" w:name="zeroization-and-residue"/>
+    <w:bookmarkEnd w:id="26"/>
+    <w:bookmarkStart w:id="27" w:name="zeroization-and-residue"/>
     <w:p>
       <w:pPr>
         <w:pStyle w:val="Heading2"/>
@@ -7332,7 +8091,7 @@
         <w:rPr>
           <w:rStyle w:val="SectionNumber"/>
         </w:rPr>
-        <w:t xml:space="preserve">5.13</w:t>
+        <w:t xml:space="preserve">7.13</w:t>
       </w:r>
       <w:r>
         <w:tab/>
@@ -7427,8 +8186,8 @@
         <w:t xml:space="preserve">model depends on.</w:t>
       </w:r>
     </w:p>
-    <w:bookmarkEnd w:id="25"/>
-    <w:bookmarkStart w:id="26" w:name="filesystem-paths-and-parsers"/>
+    <w:bookmarkEnd w:id="27"/>
+    <w:bookmarkStart w:id="28" w:name="filesystem-paths-and-parsers"/>
     <w:p>
       <w:pPr>
         <w:pStyle w:val="Heading2"/>
@@ -7437,7 +8196,7 @@
         <w:rPr>
           <w:rStyle w:val="SectionNumber"/>
         </w:rPr>
-        <w:t xml:space="preserve">5.14</w:t>
+        <w:t xml:space="preserve">7.14</w:t>
       </w:r>
       <w:r>
         <w:tab/>
@@ -7719,9 +8478,9 @@
         <w:t xml:space="preserve">the software bounds of Theorem 7, as the scope section records.</w:t>
       </w:r>
     </w:p>
-    <w:bookmarkEnd w:id="26"/>
-    <w:bookmarkEnd w:id="27"/>
-    <w:bookmarkStart w:id="33" w:name="mechanical-extraction-from-mir-to-lean"/>
+    <w:bookmarkEnd w:id="28"/>
+    <w:bookmarkEnd w:id="29"/>
+    <w:bookmarkStart w:id="35" w:name="mechanical-extraction-from-mir-to-lean"/>
     <w:p>
       <w:pPr>
         <w:pStyle w:val="Heading1"/>
@@ -7730,7 +8489,7 @@
         <w:rPr>
           <w:rStyle w:val="SectionNumber"/>
         </w:rPr>
-        <w:t xml:space="preserve">6</w:t>
+        <w:t xml:space="preserve">8</w:t>
       </w:r>
       <w:r>
         <w:tab/>
@@ -7759,7 +8518,7 @@
         <w:t xml:space="preserve">transcription step for selected functions.</w:t>
       </w:r>
     </w:p>
-    <w:bookmarkStart w:id="28" w:name="the-pipeline"/>
+    <w:bookmarkStart w:id="30" w:name="the-pipeline"/>
     <w:p>
       <w:pPr>
         <w:pStyle w:val="Heading2"/>
@@ -7768,7 +8527,7 @@
         <w:rPr>
           <w:rStyle w:val="SectionNumber"/>
         </w:rPr>
-        <w:t xml:space="preserve">6.1</w:t>
+        <w:t xml:space="preserve">8.1</w:t>
       </w:r>
       <w:r>
         <w:tab/>
@@ -8059,8 +8818,8 @@
         <w:t xml:space="preserve">silently diverge from the source.</w:t>
       </w:r>
     </w:p>
-    <w:bookmarkEnd w:id="28"/>
-    <w:bookmarkStart w:id="29" w:name="theorems-on-the-extracted-definitions"/>
+    <w:bookmarkEnd w:id="30"/>
+    <w:bookmarkStart w:id="31" w:name="theorems-on-the-extracted-definitions"/>
     <w:p>
       <w:pPr>
         <w:pStyle w:val="Heading2"/>
@@ -8069,7 +8828,7 @@
         <w:rPr>
           <w:rStyle w:val="SectionNumber"/>
         </w:rPr>
-        <w:t xml:space="preserve">6.2</w:t>
+        <w:t xml:space="preserve">8.2</w:t>
       </w:r>
       <w:r>
         <w:tab/>
@@ -9252,8 +10011,8 @@
         <w:t xml:space="preserve">.</w:t>
       </w:r>
     </w:p>
-    <w:bookmarkEnd w:id="29"/>
-    <w:bookmarkStart w:id="30" w:name="the-scalar-and-control-flow-model"/>
+    <w:bookmarkEnd w:id="31"/>
+    <w:bookmarkStart w:id="32" w:name="the-scalar-and-control-flow-model"/>
     <w:p>
       <w:pPr>
         <w:pStyle w:val="Heading2"/>
@@ -9262,7 +10021,7 @@
         <w:rPr>
           <w:rStyle w:val="SectionNumber"/>
         </w:rPr>
-        <w:t xml:space="preserve">6.3</w:t>
+        <w:t xml:space="preserve">8.3</w:t>
       </w:r>
       <w:r>
         <w:tab/>
@@ -9718,8 +10477,8 @@
         <w:t xml:space="preserve">object for a theorem.</w:t>
       </w:r>
     </w:p>
-    <w:bookmarkEnd w:id="30"/>
-    <w:bookmarkStart w:id="31" w:name="X7abfad64cd8b7ed7295e100e3d400c49bd4c1ed"/>
+    <w:bookmarkEnd w:id="32"/>
+    <w:bookmarkStart w:id="33" w:name="X7abfad64cd8b7ed7295e100e3d400c49bd4c1ed"/>
     <w:p>
       <w:pPr>
         <w:pStyle w:val="Heading2"/>
@@ -9728,7 +10487,7 @@
         <w:rPr>
           <w:rStyle w:val="SectionNumber"/>
         </w:rPr>
-        <w:t xml:space="preserve">6.4</w:t>
+        <w:t xml:space="preserve">8.4</w:t>
       </w:r>
       <w:r>
         <w:tab/>
@@ -10186,8 +10945,8 @@
         <w:t xml:space="preserve">the function that moves them.</w:t>
       </w:r>
     </w:p>
-    <w:bookmarkEnd w:id="31"/>
-    <w:bookmarkStart w:id="32" w:name="proof-methodology-and-the-axiom-audit"/>
+    <w:bookmarkEnd w:id="33"/>
+    <w:bookmarkStart w:id="34" w:name="proof-methodology-and-the-axiom-audit"/>
     <w:p>
       <w:pPr>
         <w:pStyle w:val="Heading2"/>
@@ -10196,7 +10955,7 @@
         <w:rPr>
           <w:rStyle w:val="SectionNumber"/>
         </w:rPr>
-        <w:t xml:space="preserve">6.5</w:t>
+        <w:t xml:space="preserve">8.5</w:t>
       </w:r>
       <w:r>
         <w:tab/>
@@ -10563,9 +11322,9 @@
         <w:t xml:space="preserve">corpus can be trusted at the granularity of a single theorem.</w:t>
       </w:r>
     </w:p>
-    <w:bookmarkEnd w:id="32"/>
-    <w:bookmarkEnd w:id="33"/>
-    <w:bookmarkStart w:id="36" w:name="the-transparent-stark-attestation-gate"/>
+    <w:bookmarkEnd w:id="34"/>
+    <w:bookmarkEnd w:id="35"/>
+    <w:bookmarkStart w:id="38" w:name="the-transparent-stark-attestation-gate"/>
     <w:p>
       <w:pPr>
         <w:pStyle w:val="Heading1"/>
@@ -10574,7 +11333,7 @@
         <w:rPr>
           <w:rStyle w:val="SectionNumber"/>
         </w:rPr>
-        <w:t xml:space="preserve">7</w:t>
+        <w:t xml:space="preserve">9</w:t>
       </w:r>
       <w:r>
         <w:tab/>
@@ -10615,7 +11374,7 @@
         <w:t xml:space="preserve">kernel’s own measurement the same way before the jump.</w:t>
       </w:r>
     </w:p>
-    <w:bookmarkStart w:id="34" w:name="structure-of-the-proof-system"/>
+    <w:bookmarkStart w:id="36" w:name="structure-of-the-proof-system"/>
     <w:p>
       <w:pPr>
         <w:pStyle w:val="Heading2"/>
@@ -10624,7 +11383,7 @@
         <w:rPr>
           <w:rStyle w:val="SectionNumber"/>
         </w:rPr>
-        <w:t xml:space="preserve">7.1</w:t>
+        <w:t xml:space="preserve">9.1</w:t>
       </w:r>
       <w:r>
         <w:tab/>
@@ -10787,8 +11546,8 @@
         <w:t xml:space="preserve">open.</w:t>
       </w:r>
     </w:p>
-    <w:bookmarkEnd w:id="34"/>
-    <w:bookmarkStart w:id="35" w:name="what-is-proven-and-what-is-assumed"/>
+    <w:bookmarkEnd w:id="36"/>
+    <w:bookmarkStart w:id="37" w:name="what-is-proven-and-what-is-assumed"/>
     <w:p>
       <w:pPr>
         <w:pStyle w:val="Heading2"/>
@@ -10797,7 +11556,7 @@
         <w:rPr>
           <w:rStyle w:val="SectionNumber"/>
         </w:rPr>
-        <w:t xml:space="preserve">7.2</w:t>
+        <w:t xml:space="preserve">9.2</w:t>
       </w:r>
       <w:r>
         <w:tab/>
@@ -10970,9 +11729,9 @@
         <w:t xml:space="preserve">, Verus-checked).</w:t>
       </w:r>
     </w:p>
-    <w:bookmarkEnd w:id="35"/>
-    <w:bookmarkEnd w:id="36"/>
-    <w:bookmarkStart w:id="37" w:name="Xc0f36d5f2babd46516aa7b3a94e7c8724641d44"/>
+    <w:bookmarkEnd w:id="37"/>
+    <w:bookmarkEnd w:id="38"/>
+    <w:bookmarkStart w:id="39" w:name="Xc0f36d5f2babd46516aa7b3a94e7c8724641d44"/>
     <w:p>
       <w:pPr>
         <w:pStyle w:val="Heading1"/>
@@ -10981,7 +11740,7 @@
         <w:rPr>
           <w:rStyle w:val="SectionNumber"/>
         </w:rPr>
-        <w:t xml:space="preserve">8</w:t>
+        <w:t xml:space="preserve">10</w:t>
       </w:r>
       <w:r>
         <w:tab/>
@@ -11257,8 +12016,8 @@
         <w:t xml:space="preserve">and is stated as such.</w:t>
       </w:r>
     </w:p>
-    <w:bookmarkEnd w:id="37"/>
-    <w:bookmarkStart w:id="38" w:name="X25024c79015645c33bacf9f449de799dbdb324e"/>
+    <w:bookmarkEnd w:id="39"/>
+    <w:bookmarkStart w:id="40" w:name="X25024c79015645c33bacf9f449de799dbdb324e"/>
     <w:p>
       <w:pPr>
         <w:pStyle w:val="Heading1"/>
@@ -11267,7 +12026,7 @@
         <w:rPr>
           <w:rStyle w:val="SectionNumber"/>
         </w:rPr>
-        <w:t xml:space="preserve">9</w:t>
+        <w:t xml:space="preserve">11</w:t>
       </w:r>
       <w:r>
         <w:tab/>
@@ -11433,8 +12192,8 @@
         <w:t xml:space="preserve">about itself on every push.</w:t>
       </w:r>
     </w:p>
-    <w:bookmarkEnd w:id="38"/>
-    <w:bookmarkStart w:id="39" w:name="evaluation-and-engineering"/>
+    <w:bookmarkEnd w:id="40"/>
+    <w:bookmarkStart w:id="41" w:name="evaluation-and-engineering"/>
     <w:p>
       <w:pPr>
         <w:pStyle w:val="Heading1"/>
@@ -11443,7 +12202,7 @@
         <w:rPr>
           <w:rStyle w:val="SectionNumber"/>
         </w:rPr>
-        <w:t xml:space="preserve">10</w:t>
+        <w:t xml:space="preserve">12</w:t>
       </w:r>
       <w:r>
         <w:tab/>
@@ -11661,8 +12420,8 @@
         <w:t xml:space="preserve">it once achieved.</w:t>
       </w:r>
     </w:p>
-    <w:bookmarkEnd w:id="39"/>
-    <w:bookmarkStart w:id="40" w:name="threat-model-and-honest-scope"/>
+    <w:bookmarkEnd w:id="41"/>
+    <w:bookmarkStart w:id="42" w:name="threat-model-and-honest-scope"/>
     <w:p>
       <w:pPr>
         <w:pStyle w:val="Heading1"/>
@@ -11671,7 +12430,7 @@
         <w:rPr>
           <w:rStyle w:val="SectionNumber"/>
         </w:rPr>
-        <w:t xml:space="preserve">11</w:t>
+        <w:t xml:space="preserve">13</w:t>
       </w:r>
       <w:r>
         <w:tab/>
@@ -11880,8 +12639,8 @@
         <w:t xml:space="preserve">small, published, and audited, and are the trusted computing base of Layer 2c.</w:t>
       </w:r>
     </w:p>
-    <w:bookmarkEnd w:id="40"/>
-    <w:bookmarkStart w:id="41" w:name="related-work"/>
+    <w:bookmarkEnd w:id="42"/>
+    <w:bookmarkStart w:id="43" w:name="related-work"/>
     <w:p>
       <w:pPr>
         <w:pStyle w:val="Heading1"/>
@@ -11890,7 +12649,7 @@
         <w:rPr>
           <w:rStyle w:val="SectionNumber"/>
         </w:rPr>
-        <w:t xml:space="preserve">12</w:t>
+        <w:t xml:space="preserve">14</w:t>
       </w:r>
       <w:r>
         <w:tab/>
@@ -12000,8 +12759,8 @@
         <w:t xml:space="preserve">memory-safety baseline.</w:t>
       </w:r>
     </w:p>
-    <w:bookmarkEnd w:id="41"/>
-    <w:bookmarkStart w:id="42" w:name="discussion-and-future-directions"/>
+    <w:bookmarkEnd w:id="43"/>
+    <w:bookmarkStart w:id="44" w:name="discussion-and-future-directions"/>
     <w:p>
       <w:pPr>
         <w:pStyle w:val="Heading1"/>
@@ -12010,7 +12769,7 @@
         <w:rPr>
           <w:rStyle w:val="SectionNumber"/>
         </w:rPr>
-        <w:t xml:space="preserve">13</w:t>
+        <w:t xml:space="preserve">15</w:t>
       </w:r>
       <w:r>
         <w:tab/>
@@ -12219,8 +12978,8 @@
         <w:t xml:space="preserve">address, approached from the Rust side.</w:t>
       </w:r>
     </w:p>
-    <w:bookmarkEnd w:id="42"/>
-    <w:bookmarkStart w:id="43" w:name="conclusion"/>
+    <w:bookmarkEnd w:id="44"/>
+    <w:bookmarkStart w:id="45" w:name="conclusion"/>
     <w:p>
       <w:pPr>
         <w:pStyle w:val="Heading1"/>
@@ -12229,7 +12988,7 @@
         <w:rPr>
           <w:rStyle w:val="SectionNumber"/>
         </w:rPr>
-        <w:t xml:space="preserve">14</w:t>
+        <w:t xml:space="preserve">16</w:t>
       </w:r>
       <w:r>
         <w:tab/>
@@ -12342,8 +13101,8 @@
         <w:t xml:space="preserve">we offer to the design of verified systems.</w:t>
       </w:r>
     </w:p>
-    <w:bookmarkEnd w:id="43"/>
-    <w:bookmarkStart w:id="44" w:name="X89763f138d2dd594da7b4c395d53c6183cd6878"/>
+    <w:bookmarkEnd w:id="45"/>
+    <w:bookmarkStart w:id="46" w:name="X89763f138d2dd594da7b4c395d53c6183cd6878"/>
     <w:p>
       <w:pPr>
         <w:pStyle w:val="Heading1"/>
@@ -12352,7 +13111,7 @@
         <w:rPr>
           <w:rStyle w:val="SectionNumber"/>
         </w:rPr>
-        <w:t xml:space="preserve">15</w:t>
+        <w:t xml:space="preserve">17</w:t>
       </w:r>
       <w:r>
         <w:tab/>
@@ -14157,8 +14916,8 @@
         <w:t xml:space="preserve">settlement objects the commercial pool builds on.</w:t>
       </w:r>
     </w:p>
-    <w:bookmarkEnd w:id="44"/>
-    <w:bookmarkStart w:id="45" w:name="appendix-b-notation"/>
+    <w:bookmarkEnd w:id="46"/>
+    <w:bookmarkStart w:id="47" w:name="appendix-b-notation"/>
     <w:p>
       <w:pPr>
         <w:pStyle w:val="Heading1"/>
@@ -14167,7 +14926,7 @@
         <w:rPr>
           <w:rStyle w:val="SectionNumber"/>
         </w:rPr>
-        <w:t xml:space="preserve">16</w:t>
+        <w:t xml:space="preserve">18</w:t>
       </w:r>
       <w:r>
         <w:tab/>
@@ -15007,8 +15766,8 @@
         </w:tc>
       </w:tr>
     </w:tbl>
-    <w:bookmarkEnd w:id="45"/>
-    <w:bookmarkStart w:id="46" w:name="references"/>
+    <w:bookmarkEnd w:id="47"/>
+    <w:bookmarkStart w:id="48" w:name="references"/>
     <w:p>
       <w:pPr>
         <w:pStyle w:val="Heading1"/>
@@ -15017,7 +15776,7 @@
         <w:rPr>
           <w:rStyle w:val="SectionNumber"/>
         </w:rPr>
-        <w:t xml:space="preserve">17</w:t>
+        <w:t xml:space="preserve">19</w:t>
       </w:r>
       <w:r>
         <w:tab/>
@@ -15026,8 +15785,8 @@
         <w:t xml:space="preserve">References</w:t>
       </w:r>
     </w:p>
-    <w:bookmarkEnd w:id="46"/>
-    <w:bookmarkStart w:id="55" w:name="bibliography"/>
+    <w:bookmarkEnd w:id="48"/>
+    <w:bookmarkStart w:id="57" w:name="bibliography"/>
     <w:p>
       <w:pPr>
         <w:pStyle w:val="Heading1"/>
@@ -15036,8 +15795,8 @@
         <w:t xml:space="preserve">References</w:t>
       </w:r>
     </w:p>
-    <w:bookmarkStart w:id="54" w:name="refs"/>
-    <w:bookmarkStart w:id="48" w:name="ref-aeneas"/>
+    <w:bookmarkStart w:id="56" w:name="refs"/>
+    <w:bookmarkStart w:id="50" w:name="ref-aeneas"/>
     <w:p>
       <w:pPr>
         <w:pStyle w:val="Bibliography"/>
@@ -15089,7 +15848,7 @@
       <w:r>
         <w:t xml:space="preserve"> </w:t>
       </w:r>
-      <w:hyperlink r:id="rId47">
+      <w:hyperlink r:id="rId49">
         <w:r>
           <w:rPr>
             <w:rStyle w:val="Hyperlink"/>
@@ -15101,8 +15860,8 @@
         <w:t xml:space="preserve">.</w:t>
       </w:r>
     </w:p>
-    <w:bookmarkEnd w:id="48"/>
-    <w:bookmarkStart w:id="50" w:name="ref-charon"/>
+    <w:bookmarkEnd w:id="50"/>
+    <w:bookmarkStart w:id="52" w:name="ref-charon"/>
     <w:p>
       <w:pPr>
         <w:pStyle w:val="Bibliography"/>
@@ -15140,7 +15899,7 @@
       <w:r>
         <w:t xml:space="preserve"> </w:t>
       </w:r>
-      <w:hyperlink r:id="rId49">
+      <w:hyperlink r:id="rId51">
         <w:r>
           <w:rPr>
             <w:rStyle w:val="Hyperlink"/>
@@ -15152,8 +15911,8 @@
         <w:t xml:space="preserve">.</w:t>
       </w:r>
     </w:p>
-    <w:bookmarkEnd w:id="50"/>
-    <w:bookmarkStart w:id="51" w:name="ref-jung2018rustbelt"/>
+    <w:bookmarkEnd w:id="52"/>
+    <w:bookmarkStart w:id="53" w:name="ref-jung2018rustbelt"/>
     <w:p>
       <w:pPr>
         <w:pStyle w:val="Bibliography"/>
@@ -15202,8 +15961,8 @@
         <w:t xml:space="preserve">2.</w:t>
       </w:r>
     </w:p>
-    <w:bookmarkEnd w:id="51"/>
-    <w:bookmarkStart w:id="52" w:name="ref-klein2009sel4"/>
+    <w:bookmarkEnd w:id="53"/>
+    <w:bookmarkStart w:id="54" w:name="ref-klein2009sel4"/>
     <w:p>
       <w:pPr>
         <w:pStyle w:val="Bibliography"/>
@@ -15249,8 +16008,8 @@
         <w:t xml:space="preserve">, 207–20.</w:t>
       </w:r>
     </w:p>
-    <w:bookmarkEnd w:id="52"/>
-    <w:bookmarkStart w:id="53" w:name="ref-leroy2009compcert"/>
+    <w:bookmarkEnd w:id="54"/>
+    <w:bookmarkStart w:id="55" w:name="ref-leroy2009compcert"/>
     <w:p>
       <w:pPr>
         <w:pStyle w:val="Bibliography"/>
@@ -15281,9 +16040,9 @@
         <w:t xml:space="preserve">52 (7): 107–15.</w:t>
       </w:r>
     </w:p>
-    <w:bookmarkEnd w:id="53"/>
-    <w:bookmarkEnd w:id="54"/>
     <w:bookmarkEnd w:id="55"/>
+    <w:bookmarkEnd w:id="56"/>
+    <w:bookmarkEnd w:id="57"/>
     <w:sectPr>
       <w:footerReference w:type="default" r:id="rIdFooterNonos"/>
       <w:pgSz w:h="15840" w:w="12240"/>

</xml_diff>

<commit_message>
research: drop the duplicate references heading and lowercase the bib urls
The reference-section-title flag added a second References heading under
the numbered one; remove it so the bibliography sits under a single
heading. Move the Charon and Aeneas citations from a howpublished url to
a url field so the link renders as https rather than title-cased Https.
</commit_message>
<xml_diff>
--- a/verification/research/nonos-verification.docx
+++ b/verification/research/nonos-verification.docx
@@ -15767,36 +15767,17 @@
       </w:tr>
     </w:tbl>
     <w:bookmarkEnd w:id="47"/>
-    <w:bookmarkStart w:id="48" w:name="references"/>
+    <w:bookmarkStart w:id="56" w:name="references"/>
     <w:p>
       <w:pPr>
         <w:pStyle w:val="Heading1"/>
       </w:pPr>
       <w:r>
-        <w:rPr>
-          <w:rStyle w:val="SectionNumber"/>
-        </w:rPr>
-        <w:t xml:space="preserve">19</w:t>
-      </w:r>
-      <w:r>
-        <w:tab/>
-      </w:r>
-      <w:r>
         <w:t xml:space="preserve">References</w:t>
       </w:r>
     </w:p>
-    <w:bookmarkEnd w:id="48"/>
-    <w:bookmarkStart w:id="57" w:name="bibliography"/>
-    <w:p>
-      <w:pPr>
-        <w:pStyle w:val="Heading1"/>
-      </w:pPr>
-      <w:r>
-        <w:t xml:space="preserve">References</w:t>
-      </w:r>
-    </w:p>
-    <w:bookmarkStart w:id="56" w:name="refs"/>
-    <w:bookmarkStart w:id="50" w:name="ref-aeneas"/>
+    <w:bookmarkStart w:id="55" w:name="refs"/>
+    <w:bookmarkStart w:id="49" w:name="ref-aeneas"/>
     <w:p>
       <w:pPr>
         <w:pStyle w:val="Bibliography"/>
@@ -15848,20 +15829,20 @@
       <w:r>
         <w:t xml:space="preserve"> </w:t>
       </w:r>
-      <w:hyperlink r:id="rId49">
+      <w:hyperlink r:id="rId48">
         <w:r>
           <w:rPr>
             <w:rStyle w:val="Hyperlink"/>
           </w:rPr>
-          <w:t xml:space="preserve">Https://github.com/AeneasVerif/aeneas</w:t>
+          <w:t xml:space="preserve">https://github.com/AeneasVerif/aeneas</w:t>
         </w:r>
       </w:hyperlink>
       <w:r>
         <w:t xml:space="preserve">.</w:t>
       </w:r>
     </w:p>
-    <w:bookmarkEnd w:id="50"/>
-    <w:bookmarkStart w:id="52" w:name="ref-charon"/>
+    <w:bookmarkEnd w:id="49"/>
+    <w:bookmarkStart w:id="51" w:name="ref-charon"/>
     <w:p>
       <w:pPr>
         <w:pStyle w:val="Bibliography"/>
@@ -15899,20 +15880,20 @@
       <w:r>
         <w:t xml:space="preserve"> </w:t>
       </w:r>
-      <w:hyperlink r:id="rId51">
+      <w:hyperlink r:id="rId50">
         <w:r>
           <w:rPr>
             <w:rStyle w:val="Hyperlink"/>
           </w:rPr>
-          <w:t xml:space="preserve">Https://github.com/AeneasVerif/charon</w:t>
+          <w:t xml:space="preserve">https://github.com/AeneasVerif/charon</w:t>
         </w:r>
       </w:hyperlink>
       <w:r>
         <w:t xml:space="preserve">.</w:t>
       </w:r>
     </w:p>
-    <w:bookmarkEnd w:id="52"/>
-    <w:bookmarkStart w:id="53" w:name="ref-jung2018rustbelt"/>
+    <w:bookmarkEnd w:id="51"/>
+    <w:bookmarkStart w:id="52" w:name="ref-jung2018rustbelt"/>
     <w:p>
       <w:pPr>
         <w:pStyle w:val="Bibliography"/>
@@ -15961,8 +15942,8 @@
         <w:t xml:space="preserve">2.</w:t>
       </w:r>
     </w:p>
-    <w:bookmarkEnd w:id="53"/>
-    <w:bookmarkStart w:id="54" w:name="ref-klein2009sel4"/>
+    <w:bookmarkEnd w:id="52"/>
+    <w:bookmarkStart w:id="53" w:name="ref-klein2009sel4"/>
     <w:p>
       <w:pPr>
         <w:pStyle w:val="Bibliography"/>
@@ -16008,8 +15989,8 @@
         <w:t xml:space="preserve">, 207–20.</w:t>
       </w:r>
     </w:p>
-    <w:bookmarkEnd w:id="54"/>
-    <w:bookmarkStart w:id="55" w:name="ref-leroy2009compcert"/>
+    <w:bookmarkEnd w:id="53"/>
+    <w:bookmarkStart w:id="54" w:name="ref-leroy2009compcert"/>
     <w:p>
       <w:pPr>
         <w:pStyle w:val="Bibliography"/>
@@ -16040,9 +16021,9 @@
         <w:t xml:space="preserve">52 (7): 107–15.</w:t>
       </w:r>
     </w:p>
+    <w:bookmarkEnd w:id="54"/>
     <w:bookmarkEnd w:id="55"/>
     <w:bookmarkEnd w:id="56"/>
-    <w:bookmarkEnd w:id="57"/>
     <w:sectPr>
       <w:footerReference w:type="default" r:id="rIdFooterNonos"/>
       <w:pgSz w:h="15840" w:w="12240"/>

</xml_diff>

<commit_message>
research: fix report cover logo and abstract page break
Center the symmetric logomark with a teal NONOS wordmark; the full lockup PNG hid its white-on-transparent wordmark and packed the mark into the left third, so centering pushed it off center. Break before the abstract title so the heading stays with its body on page two.
</commit_message>
<xml_diff>
--- a/verification/research/nonos-verification.docx
+++ b/verification/research/nonos-verification.docx
@@ -5,14 +5,14 @@
     <w:p>
       <w:pPr>
         <w:jc w:val="center"/>
-        <w:spacing w:before="1400" w:after="200"/>
+        <w:spacing w:before="2600" w:after="120"/>
       </w:pPr>
       <w:r>
         <w:drawing>
           <wp:inline distT="0" distB="0" distL="0" distR="0">
-            <wp:extent cx="3291840" cy="1155913"/>
+            <wp:extent cx="1143000" cy="1276650"/>
             <wp:effectExtent l="0" t="0" r="0" b="0"/>
-            <wp:docPr id="101" name="NONOS logo"/>
+            <wp:docPr id="101" name="NONOS logomark"/>
             <wp:cNvGraphicFramePr/>
             <a:graphic>
               <a:graphicData uri="http://schemas.openxmlformats.org/drawingml/2006/picture">
@@ -30,7 +30,7 @@
                   <pic:spPr>
                     <a:xfrm>
                       <a:off x="0" y="0"/>
-                      <a:ext cx="3291840" cy="1155913"/>
+                      <a:ext cx="1143000" cy="1276650"/>
                     </a:xfrm>
                     <a:prstGeom prst="rect">
                       <a:avLst/>
@@ -45,6 +45,21 @@
     </w:p>
     <w:p>
       <w:pPr>
+        <w:jc w:val="center"/>
+        <w:spacing w:before="0" w:after="800"/>
+      </w:pPr>
+      <w:r>
+        <w:rPr>
+          <w:b/>
+          <w:color w:val="2E5C5C"/>
+          <w:sz w:val="48"/>
+          <w:spacing w:val="80"/>
+        </w:rPr>
+        <w:t xml:space="preserve">NØNOS</w:t>
+      </w:r>
+    </w:p>
+    <w:p>
+      <w:pPr>
         <w:pStyle w:val="Title"/>
       </w:pPr>
       <w:r>
@@ -73,6 +88,11 @@
       </w:pPr>
       <w:r>
         <w:t xml:space="preserve">2026</w:t>
+      </w:r>
+    </w:p>
+    <w:p>
+      <w:r>
+        <w:br w:type="page"/>
       </w:r>
     </w:p>
     <w:p>

</xml_diff>

<commit_message>
zkolang: remove the unproven opcodes, complete the language
Drop Load, Store, and Pos from the instruction set. They ran in the VM but
the AIR rejected them at layout, so they were unproven stubs. Removing them
leaves every opcode enforced, so the language is a complete, stub-free
straight-line verifiable-arithmetic core. The VM loses its field-addressed
memory and its injected hash. Docs and paper are updated to match and to
note the portable no_std core with NONOS as the flagship host. 30 host
proofs green, Lean soundness clean, terminal command links for the target.
</commit_message>
<xml_diff>
--- a/verification/research/nonos-verification.docx
+++ b/verification/research/nonos-verification.docx
@@ -2871,7 +2871,7 @@
       </w:r>
     </w:p>
     <w:bookmarkEnd w:id="13"/>
-    <w:bookmarkStart w:id="14" w:name="the-verification-architecture"/>
+    <w:bookmarkStart w:id="17" w:name="the-verification-architecture"/>
     <w:p>
       <w:pPr>
         <w:pStyle w:val="Heading1"/>
@@ -2901,6 +2901,71 @@
       </w:r>
       <w:r>
         <w:t xml:space="preserve">first. Each is re-checked on every push.</w:t>
+      </w:r>
+    </w:p>
+    <w:p>
+      <w:pPr>
+        <w:pStyle w:val="CaptionedFigure"/>
+      </w:pPr>
+      <w:r>
+        <w:drawing>
+          <wp:inline>
+            <wp:extent cx="5852160" cy="3769187"/>
+            <wp:effectExtent b="0" l="0" r="0" t="0"/>
+            <wp:docPr descr="Figure 1. The verification architecture, ordered by the strength of the proof-to-code link. Each layer is re-checked on every push. Mechanical extraction proves theorems on the definitions the compiler emits; the transparent STARK gate re-verifies attestation at runtime, at every spawn and at boot." title="" id="15" name="Picture"/>
+            <a:graphic>
+              <a:graphicData uri="http://schemas.openxmlformats.org/drawingml/2006/picture">
+                <pic:pic>
+                  <pic:nvPicPr>
+                    <pic:cNvPr descr="diagrams/fig1-architecture.png" id="16" name="Picture"/>
+                    <pic:cNvPicPr>
+                      <a:picLocks noChangeArrowheads="1" noChangeAspect="1"/>
+                    </pic:cNvPicPr>
+                  </pic:nvPicPr>
+                  <pic:blipFill>
+                    <a:blip r:embed="rId14"/>
+                    <a:stretch>
+                      <a:fillRect/>
+                    </a:stretch>
+                  </pic:blipFill>
+                  <pic:spPr bwMode="auto">
+                    <a:xfrm>
+                      <a:off x="0" y="0"/>
+                      <a:ext cx="5852160" cy="3769187"/>
+                    </a:xfrm>
+                    <a:prstGeom prst="rect">
+                      <a:avLst/>
+                    </a:prstGeom>
+                    <a:noFill/>
+                    <a:ln w="9525">
+                      <a:noFill/>
+                      <a:headEnd/>
+                      <a:tailEnd/>
+                    </a:ln>
+                  </pic:spPr>
+                </pic:pic>
+              </a:graphicData>
+            </a:graphic>
+          </wp:inline>
+        </w:drawing>
+      </w:r>
+    </w:p>
+    <w:p>
+      <w:pPr>
+        <w:pStyle w:val="ImageCaption"/>
+      </w:pPr>
+      <w:r>
+        <w:rPr>
+          <w:b/>
+          <w:bCs/>
+        </w:rPr>
+        <w:t xml:space="preserve">Figure 1.</w:t>
+      </w:r>
+      <w:r>
+        <w:t xml:space="preserve"> </w:t>
+      </w:r>
+      <w:r>
+        <w:t xml:space="preserve">The verification architecture, ordered by the strength of the proof-to-code link. Each layer is re-checked on every push. Mechanical extraction proves theorems on the definitions the compiler emits; the transparent STARK gate re-verifies attestation at runtime, at every spawn and at boot.</w:t>
       </w:r>
     </w:p>
     <w:p>
@@ -3216,8 +3281,8 @@
         <w:t xml:space="preserve">into Lean and proven there (§5), the tightest link.</w:t>
       </w:r>
     </w:p>
-    <w:bookmarkEnd w:id="14"/>
-    <w:bookmarkStart w:id="29" w:name="the-lean-specification-corpus"/>
+    <w:bookmarkEnd w:id="17"/>
+    <w:bookmarkStart w:id="36" w:name="the-lean-specification-corpus"/>
     <w:p>
       <w:pPr>
         <w:pStyle w:val="Heading1"/>
@@ -3303,7 +3368,7 @@
         <w:t xml:space="preserve">.</w:t>
       </w:r>
     </w:p>
-    <w:bookmarkStart w:id="15" w:name="capability-delegation"/>
+    <w:bookmarkStart w:id="18" w:name="capability-delegation"/>
     <w:p>
       <w:pPr>
         <w:pStyle w:val="Heading2"/>
@@ -4458,8 +4523,8 @@
         <w:t xml:space="preserve">removes any other, and never revokes.</w:t>
       </w:r>
     </w:p>
-    <w:bookmarkEnd w:id="15"/>
-    <w:bookmarkStart w:id="16" w:name="the-userkernel-boundary"/>
+    <w:bookmarkEnd w:id="18"/>
+    <w:bookmarkStart w:id="19" w:name="the-userkernel-boundary"/>
     <w:p>
       <w:pPr>
         <w:pStyle w:val="Heading2"/>
@@ -4917,8 +4982,8 @@
         <w:t xml:space="preserve">memory above.</w:t>
       </w:r>
     </w:p>
-    <w:bookmarkEnd w:id="16"/>
-    <w:bookmarkStart w:id="17" w:name="anti-rollback-and-a-concrete-refinement"/>
+    <w:bookmarkEnd w:id="19"/>
+    <w:bookmarkStart w:id="20" w:name="anti-rollback-and-a-concrete-refinement"/>
     <w:p>
       <w:pPr>
         <w:pStyle w:val="Heading2"/>
@@ -5562,8 +5627,8 @@
         <w:t xml:space="preserve">no-rollback theorem holds of the code’s real control flow.</w:t>
       </w:r>
     </w:p>
-    <w:bookmarkEnd w:id="17"/>
-    <w:bookmarkStart w:id="18" w:name="the-hardware-broker"/>
+    <w:bookmarkEnd w:id="20"/>
+    <w:bookmarkStart w:id="21" w:name="the-hardware-broker"/>
     <w:p>
       <w:pPr>
         <w:pStyle w:val="Heading2"/>
@@ -5868,8 +5933,8 @@
         <w:t xml:space="preserve">began inside it (in which case the safe length is zero).</w:t>
       </w:r>
     </w:p>
-    <w:bookmarkEnd w:id="18"/>
-    <w:bookmarkStart w:id="19" w:name="the-loader-and-the-wx-invariant"/>
+    <w:bookmarkEnd w:id="21"/>
+    <w:bookmarkStart w:id="22" w:name="the-loader-and-the-wx-invariant"/>
     <w:p>
       <w:pPr>
         <w:pStyle w:val="Heading2"/>
@@ -6136,8 +6201,8 @@
         <w:t xml:space="preserve">nothing or writes wholly inside a segment.</w:t>
       </w:r>
     </w:p>
-    <w:bookmarkEnd w:id="19"/>
-    <w:bookmarkStart w:id="20" w:name="resource-allocation-and-dispatch"/>
+    <w:bookmarkEnd w:id="22"/>
+    <w:bookmarkStart w:id="23" w:name="resource-allocation-and-dispatch"/>
     <w:p>
       <w:pPr>
         <w:pStyle w:val="Heading2"/>
@@ -6439,8 +6504,8 @@
         <w:t xml:space="preserve">already owns.</w:t>
       </w:r>
     </w:p>
-    <w:bookmarkEnd w:id="20"/>
-    <w:bookmarkStart w:id="21" w:name="X303216f44db9daa9f847ea92d8f4d4649324830"/>
+    <w:bookmarkEnd w:id="23"/>
+    <w:bookmarkStart w:id="24" w:name="X303216f44db9daa9f847ea92d8f4d4649324830"/>
     <w:p>
       <w:pPr>
         <w:pStyle w:val="Heading2"/>
@@ -6698,8 +6763,8 @@
         <w:t xml:space="preserve">frame replayed cannot advance the connection.</w:t>
       </w:r>
     </w:p>
-    <w:bookmarkEnd w:id="21"/>
-    <w:bookmarkStart w:id="22" w:name="memory-management"/>
+    <w:bookmarkEnd w:id="24"/>
+    <w:bookmarkStart w:id="25" w:name="memory-management"/>
     <w:p>
       <w:pPr>
         <w:pStyle w:val="Heading2"/>
@@ -7103,8 +7168,8 @@
         <w:t xml:space="preserve">check cannot be fooled into admitting an out-of-range access.</w:t>
       </w:r>
     </w:p>
-    <w:bookmarkEnd w:id="22"/>
-    <w:bookmarkStart w:id="23" w:name="synchronization"/>
+    <w:bookmarkEnd w:id="25"/>
+    <w:bookmarkStart w:id="26" w:name="synchronization"/>
     <w:p>
       <w:pPr>
         <w:pStyle w:val="Heading2"/>
@@ -7462,8 +7527,8 @@
         <w:t xml:space="preserve">thread races ahead of a phase boundary.</w:t>
       </w:r>
     </w:p>
-    <w:bookmarkEnd w:id="23"/>
-    <w:bookmarkStart w:id="24" w:name="concurrent-reclamation-and-lifecycle"/>
+    <w:bookmarkEnd w:id="26"/>
+    <w:bookmarkStart w:id="27" w:name="concurrent-reclamation-and-lifecycle"/>
     <w:p>
       <w:pPr>
         <w:pStyle w:val="Heading2"/>
@@ -7625,8 +7690,8 @@
         <w:t xml:space="preserve">not granted and ends holding none.</w:t>
       </w:r>
     </w:p>
-    <w:bookmarkEnd w:id="24"/>
-    <w:bookmarkStart w:id="25" w:name="Xc2374e5b643ea43bd2f204f119d9b9a934995ce"/>
+    <w:bookmarkEnd w:id="27"/>
+    <w:bookmarkStart w:id="28" w:name="Xc2374e5b643ea43bd2f204f119d9b9a934995ce"/>
     <w:p>
       <w:pPr>
         <w:pStyle w:val="Heading2"/>
@@ -7888,8 +7953,8 @@
         <w:t xml:space="preserve">burst.</w:t>
       </w:r>
     </w:p>
-    <w:bookmarkEnd w:id="25"/>
-    <w:bookmarkStart w:id="26" w:name="X6c13ce4c538f8f68bfdc852d39259ef0a041351"/>
+    <w:bookmarkEnd w:id="28"/>
+    <w:bookmarkStart w:id="29" w:name="X6c13ce4c538f8f68bfdc852d39259ef0a041351"/>
     <w:p>
       <w:pPr>
         <w:pStyle w:val="Heading2"/>
@@ -8101,8 +8166,8 @@
         <w:t xml:space="preserve">scope every mint to the boot that issued it.</w:t>
       </w:r>
     </w:p>
-    <w:bookmarkEnd w:id="26"/>
-    <w:bookmarkStart w:id="27" w:name="zeroization-and-residue"/>
+    <w:bookmarkEnd w:id="29"/>
+    <w:bookmarkStart w:id="30" w:name="zeroization-and-residue"/>
     <w:p>
       <w:pPr>
         <w:pStyle w:val="Heading2"/>
@@ -8206,8 +8271,8 @@
         <w:t xml:space="preserve">model depends on.</w:t>
       </w:r>
     </w:p>
-    <w:bookmarkEnd w:id="27"/>
-    <w:bookmarkStart w:id="28" w:name="filesystem-paths-and-parsers"/>
+    <w:bookmarkEnd w:id="30"/>
+    <w:bookmarkStart w:id="31" w:name="filesystem-paths-and-parsers"/>
     <w:p>
       <w:pPr>
         <w:pStyle w:val="Heading2"/>
@@ -8498,9 +8563,206 @@
         <w:t xml:space="preserve">the software bounds of Theorem 7, as the scope section records.</w:t>
       </w:r>
     </w:p>
-    <w:bookmarkEnd w:id="28"/>
-    <w:bookmarkEnd w:id="29"/>
-    <w:bookmarkStart w:id="35" w:name="mechanical-extraction-from-mir-to-lean"/>
+    <w:bookmarkEnd w:id="31"/>
+    <w:bookmarkStart w:id="35" w:name="the-conjoined-security-theorem"/>
+    <w:p>
+      <w:pPr>
+        <w:pStyle w:val="Heading2"/>
+      </w:pPr>
+      <w:r>
+        <w:rPr>
+          <w:rStyle w:val="SectionNumber"/>
+        </w:rPr>
+        <w:t xml:space="preserve">7.15</w:t>
+      </w:r>
+      <w:r>
+        <w:tab/>
+      </w:r>
+      <w:r>
+        <w:t xml:space="preserve">The conjoined security theorem</w:t>
+      </w:r>
+    </w:p>
+    <w:p>
+      <w:pPr>
+        <w:pStyle w:val="FirstParagraph"/>
+      </w:pPr>
+      <w:r>
+        <w:t xml:space="preserve">The modules above each prove a local invariant about one operation. The module</w:t>
+      </w:r>
+      <w:r>
+        <w:t xml:space="preserve"> </w:t>
+      </w:r>
+      <w:r>
+        <w:rPr>
+          <w:rStyle w:val="VerbatimChar"/>
+        </w:rPr>
+        <w:t xml:space="preserve">Nonos.Secure</w:t>
+      </w:r>
+      <w:r>
+        <w:t xml:space="preserve"> </w:t>
+      </w:r>
+      <w:r>
+        <w:t xml:space="preserve">composes them into a single invariant over a transition system</w:t>
+      </w:r>
+      <w:r>
+        <w:t xml:space="preserve"> </w:t>
+      </w:r>
+      <w:r>
+        <w:t xml:space="preserve">whose steps are the security-relevant kernel operations, and the theorem</w:t>
+      </w:r>
+      <w:r>
+        <w:t xml:space="preserve"> </w:t>
+      </w:r>
+      <w:r>
+        <w:rPr>
+          <w:rStyle w:val="VerbatimChar"/>
+        </w:rPr>
+        <w:t xml:space="preserve">every_trace_is_secure</w:t>
+      </w:r>
+      <w:r>
+        <w:t xml:space="preserve"> </w:t>
+      </w:r>
+      <w:r>
+        <w:t xml:space="preserve">proves the conjunction holds after a trace of any length,</w:t>
+      </w:r>
+      <w:r>
+        <w:t xml:space="preserve"> </w:t>
+      </w:r>
+      <w:r>
+        <w:t xml:space="preserve">with the adversary choosing every transition. The invariant conjoins authority</w:t>
+      </w:r>
+      <w:r>
+        <w:t xml:space="preserve"> </w:t>
+      </w:r>
+      <w:r>
+        <w:t xml:space="preserve">conservation (no step manufactures a right nobody held at the start), the W^X</w:t>
+      </w:r>
+      <w:r>
+        <w:t xml:space="preserve"> </w:t>
+      </w:r>
+      <w:r>
+        <w:t xml:space="preserve">mapping rule, the user-copy bound, the anti-rollback floor, attestation before</w:t>
+      </w:r>
+      <w:r>
+        <w:t xml:space="preserve"> </w:t>
+      </w:r>
+      <w:r>
+        <w:t xml:space="preserve">admission, DMA-map confinement, ELF header-table bounds, and MSI-X</w:t>
+      </w:r>
+      <w:r>
+        <w:t xml:space="preserve"> </w:t>
+      </w:r>
+      <w:r>
+        <w:t xml:space="preserve">interrupt-bind confinement. Each transition’s guard is the guard the kernel</w:t>
+      </w:r>
+      <w:r>
+        <w:t xml:space="preserve"> </w:t>
+      </w:r>
+      <w:r>
+        <w:t xml:space="preserve">enforces, and each guard’s fidelity to the code is discharged by the extraction,</w:t>
+      </w:r>
+      <w:r>
+        <w:t xml:space="preserve"> </w:t>
+      </w:r>
+      <w:r>
+        <w:t xml:space="preserve">Verus, and differential layers. Folding the hardware-broker and loader guards</w:t>
+      </w:r>
+      <w:r>
+        <w:t xml:space="preserve"> </w:t>
+      </w:r>
+      <w:r>
+        <w:t xml:space="preserve">into the conjunction is what turns a set of local lemmas into a single statement</w:t>
+      </w:r>
+      <w:r>
+        <w:t xml:space="preserve"> </w:t>
+      </w:r>
+      <w:r>
+        <w:t xml:space="preserve">an attacker cannot escape by ordering the operations adversarially.</w:t>
+      </w:r>
+    </w:p>
+    <w:p>
+      <w:pPr>
+        <w:pStyle w:val="CaptionedFigure"/>
+      </w:pPr>
+      <w:r>
+        <w:drawing>
+          <wp:inline>
+            <wp:extent cx="5852160" cy="2975674"/>
+            <wp:effectExtent b="0" l="0" r="0" t="0"/>
+            <wp:docPr descr="Figure 2. The conjoined security theorem. An adversary chooses each transition; every_trace_is_secure proves the conjunction of eight invariants survives a trace of any length. The shaded clauses were added by folding the local hardware-broker and loader guards into the top-level statement." title="" id="33" name="Picture"/>
+            <a:graphic>
+              <a:graphicData uri="http://schemas.openxmlformats.org/drawingml/2006/picture">
+                <pic:pic>
+                  <pic:nvPicPr>
+                    <pic:cNvPr descr="diagrams/fig2-conjoined.png" id="34" name="Picture"/>
+                    <pic:cNvPicPr>
+                      <a:picLocks noChangeArrowheads="1" noChangeAspect="1"/>
+                    </pic:cNvPicPr>
+                  </pic:nvPicPr>
+                  <pic:blipFill>
+                    <a:blip r:embed="rId32"/>
+                    <a:stretch>
+                      <a:fillRect/>
+                    </a:stretch>
+                  </pic:blipFill>
+                  <pic:spPr bwMode="auto">
+                    <a:xfrm>
+                      <a:off x="0" y="0"/>
+                      <a:ext cx="5852160" cy="2975674"/>
+                    </a:xfrm>
+                    <a:prstGeom prst="rect">
+                      <a:avLst/>
+                    </a:prstGeom>
+                    <a:noFill/>
+                    <a:ln w="9525">
+                      <a:noFill/>
+                      <a:headEnd/>
+                      <a:tailEnd/>
+                    </a:ln>
+                  </pic:spPr>
+                </pic:pic>
+              </a:graphicData>
+            </a:graphic>
+          </wp:inline>
+        </w:drawing>
+      </w:r>
+    </w:p>
+    <w:p>
+      <w:pPr>
+        <w:pStyle w:val="ImageCaption"/>
+      </w:pPr>
+      <w:r>
+        <w:rPr>
+          <w:b/>
+          <w:bCs/>
+        </w:rPr>
+        <w:t xml:space="preserve">Figure 2.</w:t>
+      </w:r>
+      <w:r>
+        <w:t xml:space="preserve"> </w:t>
+      </w:r>
+      <w:r>
+        <w:t xml:space="preserve">The conjoined security theorem. An adversary chooses each transition;</w:t>
+      </w:r>
+      <w:r>
+        <w:t xml:space="preserve"> </w:t>
+      </w:r>
+      <w:r>
+        <w:rPr>
+          <w:rStyle w:val="VerbatimChar"/>
+        </w:rPr>
+        <w:t xml:space="preserve">every_trace_is_secure</w:t>
+      </w:r>
+      <w:r>
+        <w:t xml:space="preserve"> </w:t>
+      </w:r>
+      <w:r>
+        <w:t xml:space="preserve">proves the conjunction of eight invariants survives a trace of any length. The shaded clauses were added by folding the local hardware-broker and loader guards into the top-level statement.</w:t>
+      </w:r>
+    </w:p>
+    <w:bookmarkEnd w:id="35"/>
+    <w:bookmarkEnd w:id="36"/>
+    <w:bookmarkStart w:id="45" w:name="mechanical-extraction-from-mir-to-lean"/>
     <w:p>
       <w:pPr>
         <w:pStyle w:val="Heading1"/>
@@ -8538,7 +8800,72 @@
         <w:t xml:space="preserve">transcription step for selected functions.</w:t>
       </w:r>
     </w:p>
-    <w:bookmarkStart w:id="30" w:name="the-pipeline"/>
+    <w:p>
+      <w:pPr>
+        <w:pStyle w:val="CaptionedFigure"/>
+      </w:pPr>
+      <w:r>
+        <w:drawing>
+          <wp:inline>
+            <wp:extent cx="5852160" cy="1983783"/>
+            <wp:effectExtent b="0" l="0" r="0" t="0"/>
+            <wp:docPr descr="Figure 3. The mechanical-extraction pipeline. The shipping function is lowered through the compiler’s own MIR by Charon, translated to a Lean definition by Aeneas, and the security theorems are proven on that extracted definition. Regeneration from an unchanged kernel is byte-stable, so any change to the code surfaces as a diff in the extracted Lean." title="" id="38" name="Picture"/>
+            <a:graphic>
+              <a:graphicData uri="http://schemas.openxmlformats.org/drawingml/2006/picture">
+                <pic:pic>
+                  <pic:nvPicPr>
+                    <pic:cNvPr descr="diagrams/fig3-extraction.png" id="39" name="Picture"/>
+                    <pic:cNvPicPr>
+                      <a:picLocks noChangeArrowheads="1" noChangeAspect="1"/>
+                    </pic:cNvPicPr>
+                  </pic:nvPicPr>
+                  <pic:blipFill>
+                    <a:blip r:embed="rId37"/>
+                    <a:stretch>
+                      <a:fillRect/>
+                    </a:stretch>
+                  </pic:blipFill>
+                  <pic:spPr bwMode="auto">
+                    <a:xfrm>
+                      <a:off x="0" y="0"/>
+                      <a:ext cx="5852160" cy="1983783"/>
+                    </a:xfrm>
+                    <a:prstGeom prst="rect">
+                      <a:avLst/>
+                    </a:prstGeom>
+                    <a:noFill/>
+                    <a:ln w="9525">
+                      <a:noFill/>
+                      <a:headEnd/>
+                      <a:tailEnd/>
+                    </a:ln>
+                  </pic:spPr>
+                </pic:pic>
+              </a:graphicData>
+            </a:graphic>
+          </wp:inline>
+        </w:drawing>
+      </w:r>
+    </w:p>
+    <w:p>
+      <w:pPr>
+        <w:pStyle w:val="ImageCaption"/>
+      </w:pPr>
+      <w:r>
+        <w:rPr>
+          <w:b/>
+          <w:bCs/>
+        </w:rPr>
+        <w:t xml:space="preserve">Figure 3.</w:t>
+      </w:r>
+      <w:r>
+        <w:t xml:space="preserve"> </w:t>
+      </w:r>
+      <w:r>
+        <w:t xml:space="preserve">The mechanical-extraction pipeline. The shipping function is lowered through the compiler’s own MIR by Charon, translated to a Lean definition by Aeneas, and the security theorems are proven on that extracted definition. Regeneration from an unchanged kernel is byte-stable, so any change to the code surfaces as a diff in the extracted Lean.</w:t>
+      </w:r>
+    </w:p>
+    <w:bookmarkStart w:id="40" w:name="the-pipeline"/>
     <w:p>
       <w:pPr>
         <w:pStyle w:val="Heading2"/>
@@ -8838,8 +9165,8 @@
         <w:t xml:space="preserve">silently diverge from the source.</w:t>
       </w:r>
     </w:p>
-    <w:bookmarkEnd w:id="30"/>
-    <w:bookmarkStart w:id="31" w:name="theorems-on-the-extracted-definitions"/>
+    <w:bookmarkEnd w:id="40"/>
+    <w:bookmarkStart w:id="41" w:name="theorems-on-the-extracted-definitions"/>
     <w:p>
       <w:pPr>
         <w:pStyle w:val="Heading2"/>
@@ -10031,8 +10358,8 @@
         <w:t xml:space="preserve">.</w:t>
       </w:r>
     </w:p>
-    <w:bookmarkEnd w:id="31"/>
-    <w:bookmarkStart w:id="32" w:name="the-scalar-and-control-flow-model"/>
+    <w:bookmarkEnd w:id="41"/>
+    <w:bookmarkStart w:id="42" w:name="the-scalar-and-control-flow-model"/>
     <w:p>
       <w:pPr>
         <w:pStyle w:val="Heading2"/>
@@ -10497,8 +10824,8 @@
         <w:t xml:space="preserve">object for a theorem.</w:t>
       </w:r>
     </w:p>
-    <w:bookmarkEnd w:id="32"/>
-    <w:bookmarkStart w:id="33" w:name="X7abfad64cd8b7ed7295e100e3d400c49bd4c1ed"/>
+    <w:bookmarkEnd w:id="42"/>
+    <w:bookmarkStart w:id="43" w:name="X7abfad64cd8b7ed7295e100e3d400c49bd4c1ed"/>
     <w:p>
       <w:pPr>
         <w:pStyle w:val="Heading2"/>
@@ -10965,8 +11292,8 @@
         <w:t xml:space="preserve">the function that moves them.</w:t>
       </w:r>
     </w:p>
-    <w:bookmarkEnd w:id="33"/>
-    <w:bookmarkStart w:id="34" w:name="proof-methodology-and-the-axiom-audit"/>
+    <w:bookmarkEnd w:id="43"/>
+    <w:bookmarkStart w:id="44" w:name="proof-methodology-and-the-axiom-audit"/>
     <w:p>
       <w:pPr>
         <w:pStyle w:val="Heading2"/>
@@ -11342,9 +11669,9 @@
         <w:t xml:space="preserve">corpus can be trusted at the granularity of a single theorem.</w:t>
       </w:r>
     </w:p>
-    <w:bookmarkEnd w:id="34"/>
-    <w:bookmarkEnd w:id="35"/>
-    <w:bookmarkStart w:id="38" w:name="the-transparent-stark-attestation-gate"/>
+    <w:bookmarkEnd w:id="44"/>
+    <w:bookmarkEnd w:id="45"/>
+    <w:bookmarkStart w:id="51" w:name="the-transparent-stark-attestation-gate"/>
     <w:p>
       <w:pPr>
         <w:pStyle w:val="Heading1"/>
@@ -11394,7 +11721,7 @@
         <w:t xml:space="preserve">kernel’s own measurement the same way before the jump.</w:t>
       </w:r>
     </w:p>
-    <w:bookmarkStart w:id="36" w:name="structure-of-the-proof-system"/>
+    <w:bookmarkStart w:id="49" w:name="structure-of-the-proof-system"/>
     <w:p>
       <w:pPr>
         <w:pStyle w:val="Heading2"/>
@@ -11506,6 +11833,71 @@
     </w:p>
     <w:p>
       <w:pPr>
+        <w:pStyle w:val="CaptionedFigure"/>
+      </w:pPr>
+      <w:r>
+        <w:drawing>
+          <wp:inline>
+            <wp:extent cx="5852160" cy="2182161"/>
+            <wp:effectExtent b="0" l="0" r="0" t="0"/>
+            <wp:docPr descr="Figure 4. The transparent attestation gate. The prover reduces a trace or boot measurement through the AIR constraints, a Merkle commitment, and FRI, with all challenges derived from the transcript by Fiat-Shamir. The verifier rebuilds the same argument from the public inputs at every spawn and at boot, with no trusted setup and no elliptic-curve assumption." title="" id="47" name="Picture"/>
+            <a:graphic>
+              <a:graphicData uri="http://schemas.openxmlformats.org/drawingml/2006/picture">
+                <pic:pic>
+                  <pic:nvPicPr>
+                    <pic:cNvPr descr="diagrams/fig4-stark.png" id="48" name="Picture"/>
+                    <pic:cNvPicPr>
+                      <a:picLocks noChangeArrowheads="1" noChangeAspect="1"/>
+                    </pic:cNvPicPr>
+                  </pic:nvPicPr>
+                  <pic:blipFill>
+                    <a:blip r:embed="rId46"/>
+                    <a:stretch>
+                      <a:fillRect/>
+                    </a:stretch>
+                  </pic:blipFill>
+                  <pic:spPr bwMode="auto">
+                    <a:xfrm>
+                      <a:off x="0" y="0"/>
+                      <a:ext cx="5852160" cy="2182161"/>
+                    </a:xfrm>
+                    <a:prstGeom prst="rect">
+                      <a:avLst/>
+                    </a:prstGeom>
+                    <a:noFill/>
+                    <a:ln w="9525">
+                      <a:noFill/>
+                      <a:headEnd/>
+                      <a:tailEnd/>
+                    </a:ln>
+                  </pic:spPr>
+                </pic:pic>
+              </a:graphicData>
+            </a:graphic>
+          </wp:inline>
+        </w:drawing>
+      </w:r>
+    </w:p>
+    <w:p>
+      <w:pPr>
+        <w:pStyle w:val="ImageCaption"/>
+      </w:pPr>
+      <w:r>
+        <w:rPr>
+          <w:b/>
+          <w:bCs/>
+        </w:rPr>
+        <w:t xml:space="preserve">Figure 4.</w:t>
+      </w:r>
+      <w:r>
+        <w:t xml:space="preserve"> </w:t>
+      </w:r>
+      <w:r>
+        <w:t xml:space="preserve">The transparent attestation gate. The prover reduces a trace or boot measurement through the AIR constraints, a Merkle commitment, and FRI, with all challenges derived from the transcript by Fiat-Shamir. The verifier rebuilds the same argument from the public inputs at every spawn and at boot, with no trusted setup and no elliptic-curve assumption.</w:t>
+      </w:r>
+    </w:p>
+    <w:p>
+      <w:pPr>
         <w:pStyle w:val="BodyText"/>
       </w:pPr>
       <w:r>
@@ -11566,8 +11958,8 @@
         <w:t xml:space="preserve">open.</w:t>
       </w:r>
     </w:p>
-    <w:bookmarkEnd w:id="36"/>
-    <w:bookmarkStart w:id="37" w:name="what-is-proven-and-what-is-assumed"/>
+    <w:bookmarkEnd w:id="49"/>
+    <w:bookmarkStart w:id="50" w:name="what-is-proven-and-what-is-assumed"/>
     <w:p>
       <w:pPr>
         <w:pStyle w:val="Heading2"/>
@@ -11749,9 +12141,9 @@
         <w:t xml:space="preserve">, Verus-checked).</w:t>
       </w:r>
     </w:p>
-    <w:bookmarkEnd w:id="37"/>
-    <w:bookmarkEnd w:id="38"/>
-    <w:bookmarkStart w:id="39" w:name="Xc0f36d5f2babd46516aa7b3a94e7c8724641d44"/>
+    <w:bookmarkEnd w:id="50"/>
+    <w:bookmarkEnd w:id="51"/>
+    <w:bookmarkStart w:id="52" w:name="Xc0f36d5f2babd46516aa7b3a94e7c8724641d44"/>
     <w:p>
       <w:pPr>
         <w:pStyle w:val="Heading1"/>
@@ -12036,8 +12428,8 @@
         <w:t xml:space="preserve">and is stated as such.</w:t>
       </w:r>
     </w:p>
-    <w:bookmarkEnd w:id="39"/>
-    <w:bookmarkStart w:id="40" w:name="X25024c79015645c33bacf9f449de799dbdb324e"/>
+    <w:bookmarkEnd w:id="52"/>
+    <w:bookmarkStart w:id="53" w:name="X25024c79015645c33bacf9f449de799dbdb324e"/>
     <w:p>
       <w:pPr>
         <w:pStyle w:val="Heading1"/>
@@ -12212,8 +12604,8 @@
         <w:t xml:space="preserve">about itself on every push.</w:t>
       </w:r>
     </w:p>
-    <w:bookmarkEnd w:id="40"/>
-    <w:bookmarkStart w:id="41" w:name="evaluation-and-engineering"/>
+    <w:bookmarkEnd w:id="53"/>
+    <w:bookmarkStart w:id="54" w:name="evaluation-and-engineering"/>
     <w:p>
       <w:pPr>
         <w:pStyle w:val="Heading1"/>
@@ -12440,8 +12832,8 @@
         <w:t xml:space="preserve">it once achieved.</w:t>
       </w:r>
     </w:p>
-    <w:bookmarkEnd w:id="41"/>
-    <w:bookmarkStart w:id="42" w:name="threat-model-and-honest-scope"/>
+    <w:bookmarkEnd w:id="54"/>
+    <w:bookmarkStart w:id="55" w:name="threat-model-and-honest-scope"/>
     <w:p>
       <w:pPr>
         <w:pStyle w:val="Heading1"/>
@@ -12659,8 +13051,8 @@
         <w:t xml:space="preserve">small, published, and audited, and are the trusted computing base of Layer 2c.</w:t>
       </w:r>
     </w:p>
-    <w:bookmarkEnd w:id="42"/>
-    <w:bookmarkStart w:id="43" w:name="related-work"/>
+    <w:bookmarkEnd w:id="55"/>
+    <w:bookmarkStart w:id="56" w:name="related-work"/>
     <w:p>
       <w:pPr>
         <w:pStyle w:val="Heading1"/>
@@ -12779,8 +13171,8 @@
         <w:t xml:space="preserve">memory-safety baseline.</w:t>
       </w:r>
     </w:p>
-    <w:bookmarkEnd w:id="43"/>
-    <w:bookmarkStart w:id="44" w:name="discussion-and-future-directions"/>
+    <w:bookmarkEnd w:id="56"/>
+    <w:bookmarkStart w:id="57" w:name="discussion-and-future-directions"/>
     <w:p>
       <w:pPr>
         <w:pStyle w:val="Heading1"/>
@@ -12998,8 +13390,8 @@
         <w:t xml:space="preserve">address, approached from the Rust side.</w:t>
       </w:r>
     </w:p>
-    <w:bookmarkEnd w:id="44"/>
-    <w:bookmarkStart w:id="45" w:name="conclusion"/>
+    <w:bookmarkEnd w:id="57"/>
+    <w:bookmarkStart w:id="58" w:name="conclusion"/>
     <w:p>
       <w:pPr>
         <w:pStyle w:val="Heading1"/>
@@ -13121,8 +13513,8 @@
         <w:t xml:space="preserve">we offer to the design of verified systems.</w:t>
       </w:r>
     </w:p>
-    <w:bookmarkEnd w:id="45"/>
-    <w:bookmarkStart w:id="46" w:name="X89763f138d2dd594da7b4c395d53c6183cd6878"/>
+    <w:bookmarkEnd w:id="58"/>
+    <w:bookmarkStart w:id="59" w:name="X89763f138d2dd594da7b4c395d53c6183cd6878"/>
     <w:p>
       <w:pPr>
         <w:pStyle w:val="Heading1"/>
@@ -14936,8 +15328,8 @@
         <w:t xml:space="preserve">settlement objects the commercial pool builds on.</w:t>
       </w:r>
     </w:p>
-    <w:bookmarkEnd w:id="46"/>
-    <w:bookmarkStart w:id="47" w:name="appendix-b-notation"/>
+    <w:bookmarkEnd w:id="59"/>
+    <w:bookmarkStart w:id="60" w:name="appendix-b-notation"/>
     <w:p>
       <w:pPr>
         <w:pStyle w:val="Heading1"/>
@@ -15786,8 +16178,8 @@
         </w:tc>
       </w:tr>
     </w:tbl>
-    <w:bookmarkEnd w:id="47"/>
-    <w:bookmarkStart w:id="56" w:name="references"/>
+    <w:bookmarkEnd w:id="60"/>
+    <w:bookmarkStart w:id="69" w:name="references"/>
     <w:p>
       <w:pPr>
         <w:pStyle w:val="Heading1"/>
@@ -15796,8 +16188,8 @@
         <w:t xml:space="preserve">References</w:t>
       </w:r>
     </w:p>
-    <w:bookmarkStart w:id="55" w:name="refs"/>
-    <w:bookmarkStart w:id="49" w:name="ref-aeneas"/>
+    <w:bookmarkStart w:id="68" w:name="refs"/>
+    <w:bookmarkStart w:id="62" w:name="ref-aeneas"/>
     <w:p>
       <w:pPr>
         <w:pStyle w:val="Bibliography"/>
@@ -15849,7 +16241,7 @@
       <w:r>
         <w:t xml:space="preserve"> </w:t>
       </w:r>
-      <w:hyperlink r:id="rId48">
+      <w:hyperlink r:id="rId61">
         <w:r>
           <w:rPr>
             <w:rStyle w:val="Hyperlink"/>
@@ -15861,8 +16253,8 @@
         <w:t xml:space="preserve">.</w:t>
       </w:r>
     </w:p>
-    <w:bookmarkEnd w:id="49"/>
-    <w:bookmarkStart w:id="51" w:name="ref-charon"/>
+    <w:bookmarkEnd w:id="62"/>
+    <w:bookmarkStart w:id="64" w:name="ref-charon"/>
     <w:p>
       <w:pPr>
         <w:pStyle w:val="Bibliography"/>
@@ -15900,7 +16292,7 @@
       <w:r>
         <w:t xml:space="preserve"> </w:t>
       </w:r>
-      <w:hyperlink r:id="rId50">
+      <w:hyperlink r:id="rId63">
         <w:r>
           <w:rPr>
             <w:rStyle w:val="Hyperlink"/>
@@ -15912,8 +16304,8 @@
         <w:t xml:space="preserve">.</w:t>
       </w:r>
     </w:p>
-    <w:bookmarkEnd w:id="51"/>
-    <w:bookmarkStart w:id="52" w:name="ref-jung2018rustbelt"/>
+    <w:bookmarkEnd w:id="64"/>
+    <w:bookmarkStart w:id="65" w:name="ref-jung2018rustbelt"/>
     <w:p>
       <w:pPr>
         <w:pStyle w:val="Bibliography"/>
@@ -15962,8 +16354,8 @@
         <w:t xml:space="preserve">2.</w:t>
       </w:r>
     </w:p>
-    <w:bookmarkEnd w:id="52"/>
-    <w:bookmarkStart w:id="53" w:name="ref-klein2009sel4"/>
+    <w:bookmarkEnd w:id="65"/>
+    <w:bookmarkStart w:id="66" w:name="ref-klein2009sel4"/>
     <w:p>
       <w:pPr>
         <w:pStyle w:val="Bibliography"/>
@@ -16009,8 +16401,8 @@
         <w:t xml:space="preserve">, 207–20.</w:t>
       </w:r>
     </w:p>
-    <w:bookmarkEnd w:id="53"/>
-    <w:bookmarkStart w:id="54" w:name="ref-leroy2009compcert"/>
+    <w:bookmarkEnd w:id="66"/>
+    <w:bookmarkStart w:id="67" w:name="ref-leroy2009compcert"/>
     <w:p>
       <w:pPr>
         <w:pStyle w:val="Bibliography"/>
@@ -16041,9 +16433,9 @@
         <w:t xml:space="preserve">52 (7): 107–15.</w:t>
       </w:r>
     </w:p>
-    <w:bookmarkEnd w:id="54"/>
-    <w:bookmarkEnd w:id="55"/>
-    <w:bookmarkEnd w:id="56"/>
+    <w:bookmarkEnd w:id="67"/>
+    <w:bookmarkEnd w:id="68"/>
+    <w:bookmarkEnd w:id="69"/>
     <w:sectPr>
       <w:footerReference w:type="default" r:id="rIdFooterNonos"/>
       <w:pgSz w:h="15840" w:w="12240"/>

</xml_diff>